<commit_message>
A new paper and a few updates
A new paper is arXived. Changes in status of previous papers.
</commit_message>
<xml_diff>
--- a/CV.docx
+++ b/CV.docx
@@ -1,6 +1,6 @@
 
 <file path=word/document.xml><?xml version="1.0" encoding="utf-8"?>
-<w:document xmlns:wpc="http://schemas.microsoft.com/office/word/2010/wordprocessingCanvas" xmlns:cx="http://schemas.microsoft.com/office/drawing/2014/chartex" xmlns:cx1="http://schemas.microsoft.com/office/drawing/2015/9/8/chartex" xmlns:cx2="http://schemas.microsoft.com/office/drawing/2015/10/21/chartex" xmlns:cx3="http://schemas.microsoft.com/office/drawing/2016/5/9/chartex" xmlns:cx4="http://schemas.microsoft.com/office/drawing/2016/5/10/chartex" xmlns:cx5="http://schemas.microsoft.com/office/drawing/2016/5/11/chartex" xmlns:cx6="http://schemas.microsoft.com/office/drawing/2016/5/12/chartex" xmlns:cx7="http://schemas.microsoft.com/office/drawing/2016/5/13/chartex" xmlns:cx8="http://schemas.microsoft.com/office/drawing/2016/5/14/chartex" xmlns:mc="http://schemas.openxmlformats.org/markup-compatibility/2006" xmlns:aink="http://schemas.microsoft.com/office/drawing/2016/ink" xmlns:am3d="http://schemas.microsoft.com/office/drawing/2017/model3d" xmlns:o="urn:schemas-microsoft-com:office:office" xmlns:oel="http://schemas.microsoft.com/office/2019/extlst" xmlns:r="http://schemas.openxmlformats.org/officeDocument/2006/relationships" xmlns:m="http://schemas.openxmlformats.org/officeDocument/2006/math" xmlns:v="urn:schemas-microsoft-com:vml" xmlns:wp14="http://schemas.microsoft.com/office/word/2010/wordprocessingDrawing" xmlns:wp="http://schemas.openxmlformats.org/drawingml/2006/wordprocessingDrawing" xmlns:w10="urn:schemas-microsoft-com:office:word" xmlns:w="http://schemas.openxmlformats.org/wordprocessingml/2006/main" xmlns:w14="http://schemas.microsoft.com/office/word/2010/wordml" xmlns:w15="http://schemas.microsoft.com/office/word/2012/wordml" xmlns:w16cex="http://schemas.microsoft.com/office/word/2018/wordml/cex" xmlns:w16cid="http://schemas.microsoft.com/office/word/2016/wordml/cid" xmlns:w16="http://schemas.microsoft.com/office/word/2018/wordml" xmlns:w16du="http://schemas.microsoft.com/office/word/2023/wordml/word16du" xmlns:w16sdtdh="http://schemas.microsoft.com/office/word/2020/wordml/sdtdatahash" xmlns:w16se="http://schemas.microsoft.com/office/word/2015/wordml/symex" xmlns:wpg="http://schemas.microsoft.com/office/word/2010/wordprocessingGroup" xmlns:wpi="http://schemas.microsoft.com/office/word/2010/wordprocessingInk" xmlns:wne="http://schemas.microsoft.com/office/word/2006/wordml" xmlns:wps="http://schemas.microsoft.com/office/word/2010/wordprocessingShape" mc:Ignorable="w14 w15 w16se w16cid w16 w16cex w16sdtdh w16du wp14">
+<w:document xmlns:wpc="http://schemas.microsoft.com/office/word/2010/wordprocessingCanvas" xmlns:cx="http://schemas.microsoft.com/office/drawing/2014/chartex" xmlns:cx1="http://schemas.microsoft.com/office/drawing/2015/9/8/chartex" xmlns:cx2="http://schemas.microsoft.com/office/drawing/2015/10/21/chartex" xmlns:cx3="http://schemas.microsoft.com/office/drawing/2016/5/9/chartex" xmlns:cx4="http://schemas.microsoft.com/office/drawing/2016/5/10/chartex" xmlns:cx5="http://schemas.microsoft.com/office/drawing/2016/5/11/chartex" xmlns:cx6="http://schemas.microsoft.com/office/drawing/2016/5/12/chartex" xmlns:cx7="http://schemas.microsoft.com/office/drawing/2016/5/13/chartex" xmlns:cx8="http://schemas.microsoft.com/office/drawing/2016/5/14/chartex" xmlns:mc="http://schemas.openxmlformats.org/markup-compatibility/2006" xmlns:aink="http://schemas.microsoft.com/office/drawing/2016/ink" xmlns:am3d="http://schemas.microsoft.com/office/drawing/2017/model3d" xmlns:o="urn:schemas-microsoft-com:office:office" xmlns:oel="http://schemas.microsoft.com/office/2019/extlst" xmlns:r="http://schemas.openxmlformats.org/officeDocument/2006/relationships" xmlns:m="http://schemas.openxmlformats.org/officeDocument/2006/math" xmlns:v="urn:schemas-microsoft-com:vml" xmlns:wp14="http://schemas.microsoft.com/office/word/2010/wordprocessingDrawing" xmlns:wp="http://schemas.openxmlformats.org/drawingml/2006/wordprocessingDrawing" xmlns:w10="urn:schemas-microsoft-com:office:word" xmlns:w="http://schemas.openxmlformats.org/wordprocessingml/2006/main" xmlns:w14="http://schemas.microsoft.com/office/word/2010/wordml" xmlns:w15="http://schemas.microsoft.com/office/word/2012/wordml" xmlns:w16cex="http://schemas.microsoft.com/office/word/2018/wordml/cex" xmlns:w16cid="http://schemas.microsoft.com/office/word/2016/wordml/cid" xmlns:w16="http://schemas.microsoft.com/office/word/2018/wordml" xmlns:w16du="http://schemas.microsoft.com/office/word/2023/wordml/word16du" xmlns:w16sdtdh="http://schemas.microsoft.com/office/word/2020/wordml/sdtdatahash" xmlns:w16sdtfl="http://schemas.microsoft.com/office/word/2024/wordml/sdtformatlock" xmlns:w16se="http://schemas.microsoft.com/office/word/2015/wordml/symex" xmlns:wpg="http://schemas.microsoft.com/office/word/2010/wordprocessingGroup" xmlns:wpi="http://schemas.microsoft.com/office/word/2010/wordprocessingInk" xmlns:wne="http://schemas.microsoft.com/office/word/2006/wordml" xmlns:wps="http://schemas.microsoft.com/office/word/2010/wordprocessingShape" mc:Ignorable="w14 w15 w16se w16cid w16 w16cex w16sdtdh w16sdtfl w16du wp14">
   <w:body>
     <w:p/>
     <w:p>
@@ -313,21 +313,7 @@
         <w:rPr>
           <w:sz w:val="22"/>
         </w:rPr>
-        <w:t xml:space="preserve">dvisor: Prof. </w:t>
-      </w:r>
-      <w:proofErr w:type="spellStart"/>
-      <w:r>
-        <w:rPr>
-          <w:sz w:val="22"/>
-        </w:rPr>
-        <w:t>Xiaocheng</w:t>
-      </w:r>
-      <w:proofErr w:type="spellEnd"/>
-      <w:r>
-        <w:rPr>
-          <w:sz w:val="22"/>
-        </w:rPr>
-        <w:t xml:space="preserve"> Li</w:t>
+        <w:t>dvisor: Prof. Xiaocheng Li</w:t>
       </w:r>
     </w:p>
     <w:p>
@@ -614,7 +600,7 @@
         </w:pBdr>
         <w:ind w:leftChars="-74" w:left="-141" w:firstLine="420"/>
         <w:rPr>
-          <w:rFonts w:eastAsiaTheme="minorEastAsia"/>
+          <w:rFonts w:eastAsiaTheme="minorEastAsia" w:hint="eastAsia"/>
           <w:kern w:val="2"/>
           <w:sz w:val="21"/>
           <w:szCs w:val="21"/>
@@ -652,7 +638,7 @@
           <w:sz w:val="21"/>
           <w:szCs w:val="21"/>
         </w:rPr>
-        <w:t>Reward Modeling with Ordinal Feedback: Wisdom of the Crowd</w:t>
+        <w:t>How Humans Help LLMs: Assessing and Incentivizing Human Preference Annotators</w:t>
       </w:r>
     </w:p>
     <w:p>
@@ -706,39 +692,57 @@
           <w:sz w:val="21"/>
           <w:szCs w:val="21"/>
         </w:rPr>
-        <w:t xml:space="preserve"> Yu Pan*, Guanting Chen,</w:t>
-      </w:r>
-      <w:r>
-        <w:rPr>
-          <w:rFonts w:eastAsiaTheme="minorEastAsia"/>
-          <w:bCs/>
-          <w:kern w:val="2"/>
-          <w:sz w:val="21"/>
-          <w:szCs w:val="21"/>
-        </w:rPr>
         <w:t xml:space="preserve"> </w:t>
       </w:r>
-      <w:proofErr w:type="spellStart"/>
-      <w:r>
-        <w:rPr>
-          <w:rFonts w:eastAsiaTheme="minorEastAsia"/>
-          <w:bCs/>
-          <w:kern w:val="2"/>
-          <w:sz w:val="21"/>
-          <w:szCs w:val="21"/>
-        </w:rPr>
-        <w:t>Xiaocheng</w:t>
-      </w:r>
-      <w:proofErr w:type="spellEnd"/>
-      <w:r>
-        <w:rPr>
-          <w:rFonts w:eastAsiaTheme="minorEastAsia"/>
-          <w:bCs/>
-          <w:kern w:val="2"/>
-          <w:sz w:val="21"/>
-          <w:szCs w:val="21"/>
-        </w:rPr>
-        <w:t xml:space="preserve"> Li, </w:t>
+      <w:r>
+        <w:rPr>
+          <w:rFonts w:eastAsiaTheme="minorEastAsia" w:hint="eastAsia"/>
+          <w:bCs/>
+          <w:kern w:val="2"/>
+          <w:sz w:val="21"/>
+          <w:szCs w:val="21"/>
+        </w:rPr>
+        <w:t>Hanzhao Wang</w:t>
+      </w:r>
+      <w:r>
+        <w:rPr>
+          <w:rFonts w:eastAsiaTheme="minorEastAsia" w:hint="eastAsia"/>
+          <w:bCs/>
+          <w:kern w:val="2"/>
+          <w:sz w:val="21"/>
+          <w:szCs w:val="21"/>
+        </w:rPr>
+        <w:t xml:space="preserve">*, </w:t>
+      </w:r>
+      <w:r>
+        <w:rPr>
+          <w:rFonts w:eastAsiaTheme="minorEastAsia" w:hint="eastAsia"/>
+          <w:bCs/>
+          <w:kern w:val="2"/>
+          <w:sz w:val="21"/>
+          <w:szCs w:val="21"/>
+        </w:rPr>
+        <w:t>Zhongyao Ma</w:t>
+      </w:r>
+      <w:r>
+        <w:rPr>
+          <w:rFonts w:eastAsiaTheme="minorEastAsia" w:hint="eastAsia"/>
+          <w:bCs/>
+          <w:kern w:val="2"/>
+          <w:sz w:val="21"/>
+          <w:szCs w:val="21"/>
+        </w:rPr>
+        <w:t>,</w:t>
+      </w:r>
+      <w:r>
+        <w:rPr>
+          <w:rFonts w:eastAsiaTheme="minorEastAsia"/>
+          <w:bCs/>
+          <w:kern w:val="2"/>
+          <w:sz w:val="21"/>
+          <w:szCs w:val="21"/>
+        </w:rPr>
+        <w:t xml:space="preserve"> Xiaocheng Li, </w:t>
       </w:r>
       <w:hyperlink r:id="rId8" w:history="1">
         <w:r>
@@ -759,10 +763,12 @@
         <w:adjustRightInd w:val="0"/>
         <w:ind w:leftChars="149" w:left="283"/>
         <w:rPr>
-          <w:rStyle w:val="Hyperlink"/>
+          <w:rFonts w:hint="eastAsia"/>
           <w:iCs/>
-          <w:sz w:val="21"/>
-          <w:szCs w:val="21"/>
+          <w:color w:val="0000FF"/>
+          <w:sz w:val="21"/>
+          <w:szCs w:val="21"/>
+          <w:u w:val="single"/>
         </w:rPr>
       </w:pPr>
     </w:p>
@@ -788,7 +794,7 @@
           <w:sz w:val="21"/>
           <w:szCs w:val="21"/>
         </w:rPr>
-        <w:t>Towards Better Understanding of In-Context Learning Ability from In-Context Uncertainty Quantification</w:t>
+        <w:t>Reward Modeling with Ordinal Feedback: Wisdom of the Crowd</w:t>
       </w:r>
     </w:p>
     <w:p>
@@ -842,61 +848,17 @@
           <w:sz w:val="21"/>
           <w:szCs w:val="21"/>
         </w:rPr>
-        <w:t xml:space="preserve"> </w:t>
-      </w:r>
-      <w:proofErr w:type="spellStart"/>
-      <w:r>
-        <w:rPr>
-          <w:rFonts w:eastAsiaTheme="minorEastAsia" w:hint="eastAsia"/>
-          <w:bCs/>
-          <w:kern w:val="2"/>
-          <w:sz w:val="21"/>
-          <w:szCs w:val="21"/>
-        </w:rPr>
-        <w:t>Zhongze</w:t>
-      </w:r>
-      <w:proofErr w:type="spellEnd"/>
-      <w:r>
-        <w:rPr>
-          <w:rFonts w:eastAsiaTheme="minorEastAsia" w:hint="eastAsia"/>
-          <w:bCs/>
-          <w:kern w:val="2"/>
-          <w:sz w:val="21"/>
-          <w:szCs w:val="21"/>
-        </w:rPr>
-        <w:t xml:space="preserve"> Cai*, Guanting Chen,</w:t>
-      </w:r>
-      <w:r>
-        <w:rPr>
-          <w:rFonts w:eastAsiaTheme="minorEastAsia"/>
-          <w:bCs/>
-          <w:kern w:val="2"/>
-          <w:sz w:val="21"/>
-          <w:szCs w:val="21"/>
-        </w:rPr>
-        <w:t xml:space="preserve"> </w:t>
-      </w:r>
-      <w:proofErr w:type="spellStart"/>
-      <w:r>
-        <w:rPr>
-          <w:rFonts w:eastAsiaTheme="minorEastAsia"/>
-          <w:bCs/>
-          <w:kern w:val="2"/>
-          <w:sz w:val="21"/>
-          <w:szCs w:val="21"/>
-        </w:rPr>
-        <w:t>Xiaocheng</w:t>
-      </w:r>
-      <w:proofErr w:type="spellEnd"/>
-      <w:r>
-        <w:rPr>
-          <w:rFonts w:eastAsiaTheme="minorEastAsia"/>
-          <w:bCs/>
-          <w:kern w:val="2"/>
-          <w:sz w:val="21"/>
-          <w:szCs w:val="21"/>
-        </w:rPr>
-        <w:t xml:space="preserve"> Li, </w:t>
+        <w:t xml:space="preserve"> Yu Pan*, Guanting Chen,</w:t>
+      </w:r>
+      <w:r>
+        <w:rPr>
+          <w:rFonts w:eastAsiaTheme="minorEastAsia"/>
+          <w:bCs/>
+          <w:kern w:val="2"/>
+          <w:sz w:val="21"/>
+          <w:szCs w:val="21"/>
+        </w:rPr>
+        <w:t xml:space="preserve"> Xiaocheng Li, </w:t>
       </w:r>
       <w:hyperlink r:id="rId9" w:history="1">
         <w:r>
@@ -946,27 +908,7 @@
           <w:sz w:val="21"/>
           <w:szCs w:val="21"/>
         </w:rPr>
-        <w:t>Understanding the Training and Generalization of Pretrained</w:t>
-      </w:r>
-      <w:r>
-        <w:rPr>
-          <w:rFonts w:eastAsiaTheme="minorEastAsia" w:hint="eastAsia"/>
-          <w:b/>
-          <w:kern w:val="2"/>
-          <w:sz w:val="21"/>
-          <w:szCs w:val="21"/>
-        </w:rPr>
-        <w:t xml:space="preserve"> </w:t>
-      </w:r>
-      <w:r>
-        <w:rPr>
-          <w:rFonts w:eastAsiaTheme="minorEastAsia"/>
-          <w:b/>
-          <w:kern w:val="2"/>
-          <w:sz w:val="21"/>
-          <w:szCs w:val="21"/>
-        </w:rPr>
-        <w:t>Transformer for Sequential Decision Making</w:t>
+        <w:t>Towards Better Understanding of In-Context Learning Ability from In-Context Uncertainty Quantification</w:t>
       </w:r>
     </w:p>
     <w:p>
@@ -976,25 +918,42 @@
         <w:adjustRightInd w:val="0"/>
         <w:ind w:leftChars="149" w:left="283"/>
         <w:rPr>
+          <w:rStyle w:val="Hyperlink"/>
           <w:iCs/>
-          <w:color w:val="0000FF"/>
-          <w:sz w:val="21"/>
-          <w:szCs w:val="21"/>
-          <w:u w:val="single"/>
-        </w:rPr>
-      </w:pPr>
-      <w:proofErr w:type="spellStart"/>
+          <w:sz w:val="21"/>
+          <w:szCs w:val="21"/>
+        </w:rPr>
+      </w:pPr>
+      <w:r>
+        <w:rPr>
+          <w:rFonts w:eastAsiaTheme="minorEastAsia"/>
+          <w:b/>
+          <w:kern w:val="2"/>
+          <w:sz w:val="21"/>
+          <w:szCs w:val="21"/>
+        </w:rPr>
+        <w:t>Shang Liu</w:t>
+      </w:r>
       <w:r>
         <w:rPr>
           <w:rFonts w:eastAsiaTheme="minorEastAsia" w:hint="eastAsia"/>
-          <w:bCs/>
-          <w:kern w:val="2"/>
-          <w:sz w:val="21"/>
-          <w:szCs w:val="21"/>
-        </w:rPr>
-        <w:t>Hanzhao</w:t>
-      </w:r>
-      <w:proofErr w:type="spellEnd"/>
+          <w:b/>
+          <w:kern w:val="2"/>
+          <w:sz w:val="21"/>
+          <w:szCs w:val="21"/>
+        </w:rPr>
+        <w:t>*</w:t>
+      </w:r>
+      <w:r>
+        <w:rPr>
+          <w:rFonts w:eastAsiaTheme="minorEastAsia"/>
+          <w:bCs/>
+          <w:kern w:val="2"/>
+          <w:sz w:val="21"/>
+          <w:szCs w:val="21"/>
+        </w:rPr>
+        <w:t>,</w:t>
+      </w:r>
       <w:r>
         <w:rPr>
           <w:rFonts w:eastAsiaTheme="minorEastAsia" w:hint="eastAsia"/>
@@ -1003,91 +962,17 @@
           <w:sz w:val="21"/>
           <w:szCs w:val="21"/>
         </w:rPr>
-        <w:t xml:space="preserve"> Wang*, Yu Pan*, </w:t>
-      </w:r>
-      <w:proofErr w:type="spellStart"/>
-      <w:r>
-        <w:rPr>
-          <w:rFonts w:eastAsiaTheme="minorEastAsia" w:hint="eastAsia"/>
-          <w:bCs/>
-          <w:kern w:val="2"/>
-          <w:sz w:val="21"/>
-          <w:szCs w:val="21"/>
-        </w:rPr>
-        <w:t>Fupeng</w:t>
-      </w:r>
-      <w:proofErr w:type="spellEnd"/>
-      <w:r>
-        <w:rPr>
-          <w:rFonts w:eastAsiaTheme="minorEastAsia" w:hint="eastAsia"/>
-          <w:bCs/>
-          <w:kern w:val="2"/>
-          <w:sz w:val="21"/>
-          <w:szCs w:val="21"/>
-        </w:rPr>
-        <w:t xml:space="preserve"> Sun, </w:t>
-      </w:r>
-      <w:r>
-        <w:rPr>
-          <w:rFonts w:eastAsiaTheme="minorEastAsia"/>
-          <w:b/>
-          <w:kern w:val="2"/>
-          <w:sz w:val="21"/>
-          <w:szCs w:val="21"/>
-        </w:rPr>
-        <w:t>Shang Liu</w:t>
-      </w:r>
-      <w:r>
-        <w:rPr>
-          <w:rFonts w:eastAsiaTheme="minorEastAsia"/>
-          <w:bCs/>
-          <w:kern w:val="2"/>
-          <w:sz w:val="21"/>
-          <w:szCs w:val="21"/>
-        </w:rPr>
-        <w:t>,</w:t>
-      </w:r>
-      <w:r>
-        <w:rPr>
-          <w:rFonts w:eastAsiaTheme="minorEastAsia" w:hint="eastAsia"/>
-          <w:bCs/>
-          <w:kern w:val="2"/>
-          <w:sz w:val="21"/>
-          <w:szCs w:val="21"/>
-        </w:rPr>
-        <w:t xml:space="preserve"> Kalyan Talluri, Guanting Chen, </w:t>
-      </w:r>
-      <w:proofErr w:type="spellStart"/>
-      <w:r>
-        <w:rPr>
-          <w:rFonts w:eastAsiaTheme="minorEastAsia" w:hint="eastAsia"/>
-          <w:bCs/>
-          <w:kern w:val="2"/>
-          <w:sz w:val="21"/>
-          <w:szCs w:val="21"/>
-        </w:rPr>
-        <w:t>Xiaocheng</w:t>
-      </w:r>
-      <w:proofErr w:type="spellEnd"/>
-      <w:r>
-        <w:rPr>
-          <w:rFonts w:eastAsiaTheme="minorEastAsia" w:hint="eastAsia"/>
-          <w:bCs/>
-          <w:kern w:val="2"/>
-          <w:sz w:val="21"/>
-          <w:szCs w:val="21"/>
-        </w:rPr>
-        <w:t xml:space="preserve"> Li</w:t>
-      </w:r>
-      <w:r>
-        <w:rPr>
-          <w:rFonts w:eastAsiaTheme="minorEastAsia"/>
-          <w:bCs/>
-          <w:kern w:val="2"/>
-          <w:sz w:val="21"/>
-          <w:szCs w:val="21"/>
-        </w:rPr>
-        <w:t xml:space="preserve">, </w:t>
+        <w:t xml:space="preserve"> Zhongze Cai*, Guanting Chen,</w:t>
+      </w:r>
+      <w:r>
+        <w:rPr>
+          <w:rFonts w:eastAsiaTheme="minorEastAsia"/>
+          <w:bCs/>
+          <w:kern w:val="2"/>
+          <w:sz w:val="21"/>
+          <w:szCs w:val="21"/>
+        </w:rPr>
+        <w:t xml:space="preserve"> Xiaocheng Li, </w:t>
       </w:r>
       <w:hyperlink r:id="rId10" w:history="1">
         <w:r>
@@ -1131,13 +1016,33 @@
       </w:pPr>
       <w:r>
         <w:rPr>
+          <w:rFonts w:eastAsiaTheme="minorEastAsia"/>
+          <w:b/>
+          <w:kern w:val="2"/>
+          <w:sz w:val="21"/>
+          <w:szCs w:val="21"/>
+        </w:rPr>
+        <w:t>Understanding the Training and Generalization of Pretrained</w:t>
+      </w:r>
+      <w:r>
+        <w:rPr>
           <w:rFonts w:eastAsiaTheme="minorEastAsia" w:hint="eastAsia"/>
           <w:b/>
           <w:kern w:val="2"/>
           <w:sz w:val="21"/>
           <w:szCs w:val="21"/>
         </w:rPr>
-        <w:t>Towards Better Statistical Understanding of Watermarking LLMs</w:t>
+        <w:t xml:space="preserve"> </w:t>
+      </w:r>
+      <w:r>
+        <w:rPr>
+          <w:rFonts w:eastAsiaTheme="minorEastAsia"/>
+          <w:b/>
+          <w:kern w:val="2"/>
+          <w:sz w:val="21"/>
+          <w:szCs w:val="21"/>
+        </w:rPr>
+        <w:t>Transformer for Sequential Decision Making</w:t>
       </w:r>
     </w:p>
     <w:p>
@@ -1147,13 +1052,13 @@
         <w:adjustRightInd w:val="0"/>
         <w:ind w:leftChars="149" w:left="283"/>
         <w:rPr>
-          <w:rStyle w:val="Hyperlink"/>
           <w:iCs/>
-          <w:sz w:val="21"/>
-          <w:szCs w:val="21"/>
-        </w:rPr>
-      </w:pPr>
-      <w:proofErr w:type="spellStart"/>
+          <w:color w:val="0000FF"/>
+          <w:sz w:val="21"/>
+          <w:szCs w:val="21"/>
+          <w:u w:val="single"/>
+        </w:rPr>
+      </w:pPr>
       <w:r>
         <w:rPr>
           <w:rFonts w:eastAsiaTheme="minorEastAsia" w:hint="eastAsia"/>
@@ -1162,9 +1067,28 @@
           <w:sz w:val="21"/>
           <w:szCs w:val="21"/>
         </w:rPr>
-        <w:t>Zhongze</w:t>
-      </w:r>
-      <w:proofErr w:type="spellEnd"/>
+        <w:t xml:space="preserve">Hanzhao Wang*, Yu Pan*, Fupeng Sun, </w:t>
+      </w:r>
+      <w:r>
+        <w:rPr>
+          <w:rFonts w:eastAsiaTheme="minorEastAsia"/>
+          <w:b/>
+          <w:kern w:val="2"/>
+          <w:sz w:val="21"/>
+          <w:szCs w:val="21"/>
+        </w:rPr>
+        <w:t>Shang Liu</w:t>
+      </w:r>
+      <w:r>
+        <w:rPr>
+          <w:rFonts w:eastAsiaTheme="minorEastAsia"/>
+          <w:bCs/>
+          <w:kern w:val="2"/>
+          <w:sz w:val="21"/>
+          <w:szCs w:val="21"/>
+        </w:rPr>
+        <w:t>,</w:t>
+      </w:r>
       <w:r>
         <w:rPr>
           <w:rFonts w:eastAsiaTheme="minorEastAsia" w:hint="eastAsia"/>
@@ -1173,123 +1097,17 @@
           <w:sz w:val="21"/>
           <w:szCs w:val="21"/>
         </w:rPr>
-        <w:t xml:space="preserve"> Cai*, </w:t>
-      </w:r>
-      <w:r>
-        <w:rPr>
-          <w:rFonts w:eastAsiaTheme="minorEastAsia"/>
-          <w:b/>
-          <w:kern w:val="2"/>
-          <w:sz w:val="21"/>
-          <w:szCs w:val="21"/>
-        </w:rPr>
-        <w:t>Shang Liu</w:t>
-      </w:r>
-      <w:r>
-        <w:rPr>
-          <w:rFonts w:eastAsiaTheme="minorEastAsia" w:hint="eastAsia"/>
-          <w:b/>
-          <w:kern w:val="2"/>
-          <w:sz w:val="21"/>
-          <w:szCs w:val="21"/>
-        </w:rPr>
-        <w:t>*</w:t>
-      </w:r>
-      <w:r>
-        <w:rPr>
-          <w:rFonts w:eastAsiaTheme="minorEastAsia"/>
-          <w:bCs/>
-          <w:kern w:val="2"/>
-          <w:sz w:val="21"/>
-          <w:szCs w:val="21"/>
-        </w:rPr>
-        <w:t>,</w:t>
-      </w:r>
-      <w:r>
-        <w:rPr>
-          <w:rFonts w:eastAsiaTheme="minorEastAsia" w:hint="eastAsia"/>
-          <w:bCs/>
-          <w:kern w:val="2"/>
-          <w:sz w:val="21"/>
-          <w:szCs w:val="21"/>
-        </w:rPr>
-        <w:t xml:space="preserve"> </w:t>
-      </w:r>
-      <w:proofErr w:type="spellStart"/>
-      <w:r>
-        <w:rPr>
-          <w:rFonts w:eastAsiaTheme="minorEastAsia" w:hint="eastAsia"/>
-          <w:bCs/>
-          <w:kern w:val="2"/>
-          <w:sz w:val="21"/>
-          <w:szCs w:val="21"/>
-        </w:rPr>
-        <w:t>Hanzhao</w:t>
-      </w:r>
-      <w:proofErr w:type="spellEnd"/>
-      <w:r>
-        <w:rPr>
-          <w:rFonts w:eastAsiaTheme="minorEastAsia" w:hint="eastAsia"/>
-          <w:bCs/>
-          <w:kern w:val="2"/>
-          <w:sz w:val="21"/>
-          <w:szCs w:val="21"/>
-        </w:rPr>
-        <w:t xml:space="preserve"> Wang*, </w:t>
-      </w:r>
-      <w:proofErr w:type="spellStart"/>
-      <w:r>
-        <w:rPr>
-          <w:rFonts w:eastAsiaTheme="minorEastAsia" w:hint="eastAsia"/>
-          <w:bCs/>
-          <w:kern w:val="2"/>
-          <w:sz w:val="21"/>
-          <w:szCs w:val="21"/>
-        </w:rPr>
-        <w:t>Huaiyang</w:t>
-      </w:r>
-      <w:proofErr w:type="spellEnd"/>
-      <w:r>
-        <w:rPr>
-          <w:rFonts w:eastAsiaTheme="minorEastAsia" w:hint="eastAsia"/>
-          <w:bCs/>
-          <w:kern w:val="2"/>
-          <w:sz w:val="21"/>
-          <w:szCs w:val="21"/>
-        </w:rPr>
-        <w:t xml:space="preserve"> Zhong,</w:t>
-      </w:r>
-      <w:r>
-        <w:rPr>
-          <w:rFonts w:eastAsiaTheme="minorEastAsia"/>
-          <w:bCs/>
-          <w:kern w:val="2"/>
-          <w:sz w:val="21"/>
-          <w:szCs w:val="21"/>
-        </w:rPr>
-        <w:t xml:space="preserve"> </w:t>
-      </w:r>
-      <w:proofErr w:type="spellStart"/>
-      <w:r>
-        <w:rPr>
-          <w:rFonts w:eastAsiaTheme="minorEastAsia"/>
-          <w:bCs/>
-          <w:kern w:val="2"/>
-          <w:sz w:val="21"/>
-          <w:szCs w:val="21"/>
-        </w:rPr>
-        <w:t>Xiaocheng</w:t>
-      </w:r>
-      <w:proofErr w:type="spellEnd"/>
-      <w:r>
-        <w:rPr>
-          <w:rFonts w:eastAsiaTheme="minorEastAsia"/>
-          <w:bCs/>
-          <w:kern w:val="2"/>
-          <w:sz w:val="21"/>
-          <w:szCs w:val="21"/>
-        </w:rPr>
-        <w:t xml:space="preserve"> Li, </w:t>
+        <w:t xml:space="preserve"> Kalyan Talluri, Guanting Chen, Xiaocheng Li</w:t>
+      </w:r>
+      <w:r>
+        <w:rPr>
+          <w:rFonts w:eastAsiaTheme="minorEastAsia"/>
+          <w:bCs/>
+          <w:kern w:val="2"/>
+          <w:sz w:val="21"/>
+          <w:szCs w:val="21"/>
+        </w:rPr>
+        <w:t xml:space="preserve">, </w:t>
       </w:r>
       <w:hyperlink r:id="rId11" w:history="1">
         <w:r>
@@ -1311,7 +1129,6 @@
         <w:ind w:leftChars="149" w:left="283"/>
         <w:rPr>
           <w:rStyle w:val="Hyperlink"/>
-          <w:rFonts w:hint="eastAsia"/>
           <w:iCs/>
           <w:sz w:val="21"/>
           <w:szCs w:val="21"/>
@@ -1334,33 +1151,13 @@
       </w:pPr>
       <w:r>
         <w:rPr>
-          <w:rFonts w:eastAsiaTheme="minorEastAsia"/>
-          <w:b/>
-          <w:kern w:val="2"/>
-          <w:sz w:val="21"/>
-          <w:szCs w:val="21"/>
-        </w:rPr>
-        <w:t xml:space="preserve">When No-Rejection Learning is </w:t>
-      </w:r>
-      <w:r>
-        <w:rPr>
-          <w:rFonts w:eastAsiaTheme="minorEastAsia"/>
-          <w:b/>
-          <w:kern w:val="2"/>
-          <w:sz w:val="21"/>
-          <w:szCs w:val="21"/>
-        </w:rPr>
-        <w:t>Consistent</w:t>
-      </w:r>
-      <w:r>
-        <w:rPr>
-          <w:rFonts w:eastAsiaTheme="minorEastAsia"/>
-          <w:b/>
-          <w:kern w:val="2"/>
-          <w:sz w:val="21"/>
-          <w:szCs w:val="21"/>
-        </w:rPr>
-        <w:t xml:space="preserve"> for Regression with Rejection</w:t>
+          <w:rFonts w:eastAsiaTheme="minorEastAsia" w:hint="eastAsia"/>
+          <w:b/>
+          <w:kern w:val="2"/>
+          <w:sz w:val="21"/>
+          <w:szCs w:val="21"/>
+        </w:rPr>
+        <w:t>Towards Better Statistical Understanding of Watermarking LLMs</w:t>
       </w:r>
     </w:p>
     <w:p>
@@ -1376,7 +1173,6 @@
           <w:szCs w:val="21"/>
         </w:rPr>
       </w:pPr>
-      <w:proofErr w:type="spellStart"/>
       <w:r>
         <w:rPr>
           <w:rFonts w:eastAsiaTheme="minorEastAsia" w:hint="eastAsia"/>
@@ -1385,38 +1181,7 @@
           <w:sz w:val="21"/>
           <w:szCs w:val="21"/>
         </w:rPr>
-        <w:t>X</w:t>
-      </w:r>
-      <w:r>
-        <w:rPr>
-          <w:rFonts w:eastAsiaTheme="minorEastAsia"/>
-          <w:bCs/>
-          <w:kern w:val="2"/>
-          <w:sz w:val="21"/>
-          <w:szCs w:val="21"/>
-        </w:rPr>
-        <w:t>iaocheng</w:t>
-      </w:r>
-      <w:proofErr w:type="spellEnd"/>
-      <w:r>
-        <w:rPr>
-          <w:rFonts w:eastAsiaTheme="minorEastAsia"/>
-          <w:bCs/>
-          <w:kern w:val="2"/>
-          <w:sz w:val="21"/>
-          <w:szCs w:val="21"/>
-        </w:rPr>
-        <w:t xml:space="preserve"> Li,</w:t>
-      </w:r>
-      <w:r>
-        <w:rPr>
-          <w:rFonts w:eastAsiaTheme="minorEastAsia"/>
-          <w:b/>
-          <w:kern w:val="2"/>
-          <w:sz w:val="21"/>
-          <w:szCs w:val="21"/>
-        </w:rPr>
-        <w:t xml:space="preserve"> </w:t>
+        <w:t xml:space="preserve">Zhongze Cai*, </w:t>
       </w:r>
       <w:r>
         <w:rPr>
@@ -1430,35 +1195,43 @@
       </w:r>
       <w:r>
         <w:rPr>
-          <w:rFonts w:eastAsiaTheme="minorEastAsia"/>
-          <w:bCs/>
-          <w:kern w:val="2"/>
-          <w:sz w:val="21"/>
-          <w:szCs w:val="21"/>
-        </w:rPr>
-        <w:t xml:space="preserve">, Chunlin Sun, </w:t>
-      </w:r>
-      <w:proofErr w:type="spellStart"/>
-      <w:r>
-        <w:rPr>
-          <w:rFonts w:eastAsiaTheme="minorEastAsia"/>
-          <w:bCs/>
-          <w:kern w:val="2"/>
-          <w:sz w:val="21"/>
-          <w:szCs w:val="21"/>
-        </w:rPr>
-        <w:t>Hanzhao</w:t>
-      </w:r>
-      <w:proofErr w:type="spellEnd"/>
-      <w:r>
-        <w:rPr>
-          <w:rFonts w:eastAsiaTheme="minorEastAsia"/>
-          <w:bCs/>
-          <w:kern w:val="2"/>
-          <w:sz w:val="21"/>
-          <w:szCs w:val="21"/>
-        </w:rPr>
-        <w:t xml:space="preserve"> Wang, </w:t>
+          <w:rFonts w:eastAsiaTheme="minorEastAsia" w:hint="eastAsia"/>
+          <w:b/>
+          <w:kern w:val="2"/>
+          <w:sz w:val="21"/>
+          <w:szCs w:val="21"/>
+        </w:rPr>
+        <w:t>*</w:t>
+      </w:r>
+      <w:r>
+        <w:rPr>
+          <w:rFonts w:eastAsiaTheme="minorEastAsia"/>
+          <w:bCs/>
+          <w:kern w:val="2"/>
+          <w:sz w:val="21"/>
+          <w:szCs w:val="21"/>
+        </w:rPr>
+        <w:t>,</w:t>
+      </w:r>
+      <w:r>
+        <w:rPr>
+          <w:rFonts w:eastAsiaTheme="minorEastAsia" w:hint="eastAsia"/>
+          <w:bCs/>
+          <w:kern w:val="2"/>
+          <w:sz w:val="21"/>
+          <w:szCs w:val="21"/>
+        </w:rPr>
+        <w:t xml:space="preserve"> Hanzhao Wang*, Huaiyang Zhong,</w:t>
+      </w:r>
+      <w:r>
+        <w:rPr>
+          <w:rFonts w:eastAsiaTheme="minorEastAsia"/>
+          <w:bCs/>
+          <w:kern w:val="2"/>
+          <w:sz w:val="21"/>
+          <w:szCs w:val="21"/>
+        </w:rPr>
+        <w:t xml:space="preserve"> Xiaocheng Li, </w:t>
       </w:r>
       <w:r>
         <w:rPr>
@@ -1470,11 +1243,23 @@
           <w:sz w:val="21"/>
           <w:szCs w:val="21"/>
         </w:rPr>
-        <w:t>AISTATS 2024</w:t>
-      </w:r>
-      <w:r>
-        <w:rPr>
-          <w:rFonts w:eastAsiaTheme="minorEastAsia"/>
+        <w:t xml:space="preserve">under Major Revision at </w:t>
+      </w:r>
+      <w:r>
+        <w:rPr>
+          <w:rFonts w:eastAsiaTheme="minorEastAsia"/>
+          <w:bCs/>
+          <w:i/>
+          <w:iCs/>
+          <w:kern w:val="2"/>
+          <w:sz w:val="21"/>
+          <w:szCs w:val="21"/>
+        </w:rPr>
+        <w:t>Journal of the American Statistical Association</w:t>
+      </w:r>
+      <w:r>
+        <w:rPr>
+          <w:rFonts w:eastAsiaTheme="minorEastAsia" w:hint="eastAsia"/>
           <w:bCs/>
           <w:kern w:val="2"/>
           <w:sz w:val="21"/>
@@ -1534,23 +1319,33 @@
       </w:pPr>
       <w:r>
         <w:rPr>
-          <w:rFonts w:eastAsiaTheme="minorEastAsia" w:hint="eastAsia"/>
-          <w:b/>
-          <w:kern w:val="2"/>
-          <w:sz w:val="21"/>
-          <w:szCs w:val="21"/>
-        </w:rPr>
-        <w:t>Un</w:t>
-      </w:r>
-      <w:r>
-        <w:rPr>
-          <w:rFonts w:eastAsiaTheme="minorEastAsia"/>
-          <w:b/>
-          <w:kern w:val="2"/>
-          <w:sz w:val="21"/>
-          <w:szCs w:val="21"/>
-        </w:rPr>
-        <w:t>derstanding Uncertainty Sampling</w:t>
+          <w:rFonts w:eastAsiaTheme="minorEastAsia"/>
+          <w:b/>
+          <w:kern w:val="2"/>
+          <w:sz w:val="21"/>
+          <w:szCs w:val="21"/>
+        </w:rPr>
+        <w:t xml:space="preserve">When No-Rejection Learning is </w:t>
+      </w:r>
+      <w:r>
+        <w:rPr>
+          <w:rFonts w:eastAsiaTheme="minorEastAsia"/>
+          <w:b/>
+          <w:kern w:val="2"/>
+          <w:sz w:val="21"/>
+          <w:szCs w:val="21"/>
+        </w:rPr>
+        <w:t>Consistent</w:t>
+      </w:r>
+      <w:r>
+        <w:rPr>
+          <w:rFonts w:eastAsiaTheme="minorEastAsia"/>
+          <w:b/>
+          <w:kern w:val="2"/>
+          <w:sz w:val="21"/>
+          <w:szCs w:val="21"/>
+        </w:rPr>
+        <w:t xml:space="preserve"> for Regression with Rejection</w:t>
       </w:r>
     </w:p>
     <w:p>
@@ -1568,6 +1363,36 @@
       </w:pPr>
       <w:r>
         <w:rPr>
+          <w:rFonts w:eastAsiaTheme="minorEastAsia" w:hint="eastAsia"/>
+          <w:bCs/>
+          <w:kern w:val="2"/>
+          <w:sz w:val="21"/>
+          <w:szCs w:val="21"/>
+        </w:rPr>
+        <w:t>X</w:t>
+      </w:r>
+      <w:r>
+        <w:rPr>
+          <w:rFonts w:eastAsiaTheme="minorEastAsia"/>
+          <w:bCs/>
+          <w:kern w:val="2"/>
+          <w:sz w:val="21"/>
+          <w:szCs w:val="21"/>
+        </w:rPr>
+        <w:t>iaocheng Li,</w:t>
+      </w:r>
+      <w:r>
+        <w:rPr>
+          <w:rFonts w:eastAsiaTheme="minorEastAsia"/>
+          <w:b/>
+          <w:kern w:val="2"/>
+          <w:sz w:val="21"/>
+          <w:szCs w:val="21"/>
+        </w:rPr>
+        <w:t xml:space="preserve"> </w:t>
+      </w:r>
+      <w:r>
+        <w:rPr>
           <w:rFonts w:eastAsiaTheme="minorEastAsia"/>
           <w:b/>
           <w:kern w:val="2"/>
@@ -1584,29 +1409,7 @@
           <w:sz w:val="21"/>
           <w:szCs w:val="21"/>
         </w:rPr>
-        <w:t xml:space="preserve">, </w:t>
-      </w:r>
-      <w:proofErr w:type="spellStart"/>
-      <w:r>
-        <w:rPr>
-          <w:rFonts w:eastAsiaTheme="minorEastAsia"/>
-          <w:bCs/>
-          <w:kern w:val="2"/>
-          <w:sz w:val="21"/>
-          <w:szCs w:val="21"/>
-        </w:rPr>
-        <w:t>Xiaocheng</w:t>
-      </w:r>
-      <w:proofErr w:type="spellEnd"/>
-      <w:r>
-        <w:rPr>
-          <w:rFonts w:eastAsiaTheme="minorEastAsia"/>
-          <w:bCs/>
-          <w:kern w:val="2"/>
-          <w:sz w:val="21"/>
-          <w:szCs w:val="21"/>
-        </w:rPr>
-        <w:t xml:space="preserve"> Li, </w:t>
+        <w:t xml:space="preserve">, Chunlin Sun, Hanzhao Wang, </w:t>
       </w:r>
       <w:r>
         <w:rPr>
@@ -1618,7 +1421,7 @@
           <w:sz w:val="21"/>
           <w:szCs w:val="21"/>
         </w:rPr>
-        <w:t>submitted</w:t>
+        <w:t>AISTATS 2024</w:t>
       </w:r>
       <w:r>
         <w:rPr>
@@ -1682,13 +1485,23 @@
       </w:pPr>
       <w:r>
         <w:rPr>
-          <w:rFonts w:eastAsiaTheme="minorEastAsia"/>
-          <w:b/>
-          <w:kern w:val="2"/>
-          <w:sz w:val="21"/>
-          <w:szCs w:val="21"/>
-        </w:rPr>
-        <w:t>Distribution-Free Model-Agnostic Regression Calibration via Nonparametric Methods</w:t>
+          <w:rFonts w:eastAsiaTheme="minorEastAsia" w:hint="eastAsia"/>
+          <w:b/>
+          <w:kern w:val="2"/>
+          <w:sz w:val="21"/>
+          <w:szCs w:val="21"/>
+        </w:rPr>
+        <w:t>Un</w:t>
+      </w:r>
+      <w:r>
+        <w:rPr>
+          <w:rFonts w:eastAsiaTheme="minorEastAsia"/>
+          <w:b/>
+          <w:kern w:val="2"/>
+          <w:sz w:val="21"/>
+          <w:szCs w:val="21"/>
+        </w:rPr>
+        <w:t>derstanding Uncertainty Sampling</w:t>
       </w:r>
     </w:p>
     <w:p>
@@ -1698,9 +1511,8 @@
         <w:adjustRightInd w:val="0"/>
         <w:ind w:leftChars="149" w:left="283"/>
         <w:rPr>
-          <w:rFonts w:eastAsiaTheme="minorEastAsia"/>
-          <w:bCs/>
-          <w:kern w:val="2"/>
+          <w:rStyle w:val="Hyperlink"/>
+          <w:iCs/>
           <w:sz w:val="21"/>
           <w:szCs w:val="21"/>
         </w:rPr>
@@ -1723,66 +1535,11 @@
           <w:sz w:val="21"/>
           <w:szCs w:val="21"/>
         </w:rPr>
-        <w:t xml:space="preserve">*, </w:t>
-      </w:r>
-      <w:proofErr w:type="spellStart"/>
+        <w:t xml:space="preserve">, Xiaocheng Li, </w:t>
+      </w:r>
       <w:r>
         <w:rPr>
           <w:rFonts w:eastAsiaTheme="minorEastAsia" w:hint="eastAsia"/>
-          <w:bCs/>
-          <w:kern w:val="2"/>
-          <w:sz w:val="21"/>
-          <w:szCs w:val="21"/>
-        </w:rPr>
-        <w:t>Z</w:t>
-      </w:r>
-      <w:r>
-        <w:rPr>
-          <w:rFonts w:eastAsiaTheme="minorEastAsia"/>
-          <w:bCs/>
-          <w:kern w:val="2"/>
-          <w:sz w:val="21"/>
-          <w:szCs w:val="21"/>
-        </w:rPr>
-        <w:t>hongze</w:t>
-      </w:r>
-      <w:proofErr w:type="spellEnd"/>
-      <w:r>
-        <w:rPr>
-          <w:rFonts w:eastAsiaTheme="minorEastAsia"/>
-          <w:bCs/>
-          <w:kern w:val="2"/>
-          <w:sz w:val="21"/>
-          <w:szCs w:val="21"/>
-        </w:rPr>
-        <w:t xml:space="preserve"> Cai*, </w:t>
-      </w:r>
-      <w:proofErr w:type="spellStart"/>
-      <w:r>
-        <w:rPr>
-          <w:rFonts w:eastAsiaTheme="minorEastAsia"/>
-          <w:bCs/>
-          <w:kern w:val="2"/>
-          <w:sz w:val="21"/>
-          <w:szCs w:val="21"/>
-        </w:rPr>
-        <w:t>Xiaocheng</w:t>
-      </w:r>
-      <w:proofErr w:type="spellEnd"/>
-      <w:r>
-        <w:rPr>
-          <w:rFonts w:eastAsiaTheme="minorEastAsia"/>
-          <w:bCs/>
-          <w:kern w:val="2"/>
-          <w:sz w:val="21"/>
-          <w:szCs w:val="21"/>
-        </w:rPr>
-        <w:t xml:space="preserve"> Li, </w:t>
-      </w:r>
-      <w:proofErr w:type="spellStart"/>
-      <w:r>
-        <w:rPr>
-          <w:rFonts w:eastAsiaTheme="minorEastAsia"/>
           <w:bCs/>
           <w:i/>
           <w:iCs/>
@@ -1790,9 +1547,8 @@
           <w:sz w:val="21"/>
           <w:szCs w:val="21"/>
         </w:rPr>
-        <w:t>NeurIPS</w:t>
-      </w:r>
-      <w:proofErr w:type="spellEnd"/>
+        <w:t xml:space="preserve">under Rejection and Resubmission at </w:t>
+      </w:r>
       <w:r>
         <w:rPr>
           <w:rFonts w:eastAsiaTheme="minorEastAsia"/>
@@ -1803,7 +1559,7 @@
           <w:sz w:val="21"/>
           <w:szCs w:val="21"/>
         </w:rPr>
-        <w:t xml:space="preserve"> 2023</w:t>
+        <w:t>Journal of Machine Learning Research</w:t>
       </w:r>
       <w:r>
         <w:rPr>
@@ -1873,47 +1629,7 @@
           <w:sz w:val="21"/>
           <w:szCs w:val="21"/>
         </w:rPr>
-        <w:t>Maximum Optimality Margin: A Unified Approach for</w:t>
-      </w:r>
-      <w:r>
-        <w:rPr>
-          <w:rFonts w:eastAsiaTheme="minorEastAsia"/>
-          <w:b/>
-          <w:kern w:val="2"/>
-          <w:sz w:val="21"/>
-          <w:szCs w:val="21"/>
-        </w:rPr>
-        <w:t xml:space="preserve"> </w:t>
-      </w:r>
-      <w:r>
-        <w:rPr>
-          <w:rFonts w:eastAsiaTheme="minorEastAsia"/>
-          <w:b/>
-          <w:kern w:val="2"/>
-          <w:sz w:val="21"/>
-          <w:szCs w:val="21"/>
-        </w:rPr>
-        <w:t>Contextual Linear Programming and Inverse Linear</w:t>
-      </w:r>
-      <w:r>
-        <w:rPr>
-          <w:rFonts w:eastAsiaTheme="minorEastAsia"/>
-          <w:b/>
-          <w:kern w:val="2"/>
-          <w:sz w:val="21"/>
-          <w:szCs w:val="21"/>
-        </w:rPr>
-        <w:t xml:space="preserve"> </w:t>
-      </w:r>
-      <w:r>
-        <w:rPr>
-          <w:rFonts w:eastAsiaTheme="minorEastAsia"/>
-          <w:b/>
-          <w:kern w:val="2"/>
-          <w:sz w:val="21"/>
-          <w:szCs w:val="21"/>
-        </w:rPr>
-        <w:t>Programming</w:t>
+        <w:t>Distribution-Free Model-Agnostic Regression Calibration via Nonparametric Methods</w:t>
       </w:r>
     </w:p>
     <w:p>
@@ -1923,22 +1639,13 @@
         <w:adjustRightInd w:val="0"/>
         <w:ind w:leftChars="149" w:left="283"/>
         <w:rPr>
-          <w:rStyle w:val="Hyperlink"/>
-          <w:iCs/>
-          <w:sz w:val="21"/>
-          <w:szCs w:val="21"/>
-        </w:rPr>
-      </w:pPr>
-      <w:r>
-        <w:rPr>
-          <w:rFonts w:eastAsiaTheme="minorEastAsia"/>
-          <w:bCs/>
-          <w:kern w:val="2"/>
-          <w:sz w:val="21"/>
-          <w:szCs w:val="21"/>
-        </w:rPr>
-        <w:t xml:space="preserve">Chunlin Sun*, </w:t>
-      </w:r>
+          <w:rFonts w:eastAsiaTheme="minorEastAsia"/>
+          <w:bCs/>
+          <w:kern w:val="2"/>
+          <w:sz w:val="21"/>
+          <w:szCs w:val="21"/>
+        </w:rPr>
+      </w:pPr>
       <w:r>
         <w:rPr>
           <w:rFonts w:eastAsiaTheme="minorEastAsia"/>
@@ -1959,27 +1666,25 @@
         </w:rPr>
         <w:t xml:space="preserve">*, </w:t>
       </w:r>
-      <w:proofErr w:type="spellStart"/>
-      <w:r>
-        <w:rPr>
-          <w:rFonts w:eastAsiaTheme="minorEastAsia"/>
-          <w:bCs/>
-          <w:kern w:val="2"/>
-          <w:sz w:val="21"/>
-          <w:szCs w:val="21"/>
-        </w:rPr>
-        <w:t>Xiaocheng</w:t>
-      </w:r>
-      <w:proofErr w:type="spellEnd"/>
-      <w:r>
-        <w:rPr>
-          <w:rFonts w:eastAsiaTheme="minorEastAsia"/>
-          <w:bCs/>
-          <w:kern w:val="2"/>
-          <w:sz w:val="21"/>
-          <w:szCs w:val="21"/>
-        </w:rPr>
-        <w:t xml:space="preserve"> Li,</w:t>
+      <w:r>
+        <w:rPr>
+          <w:rFonts w:eastAsiaTheme="minorEastAsia" w:hint="eastAsia"/>
+          <w:bCs/>
+          <w:kern w:val="2"/>
+          <w:sz w:val="21"/>
+          <w:szCs w:val="21"/>
+        </w:rPr>
+        <w:t>Z</w:t>
+      </w:r>
+      <w:r>
+        <w:rPr>
+          <w:rFonts w:eastAsiaTheme="minorEastAsia"/>
+          <w:bCs/>
+          <w:kern w:val="2"/>
+          <w:sz w:val="21"/>
+          <w:szCs w:val="21"/>
+        </w:rPr>
+        <w:t xml:space="preserve">hongze Cai*, Xiaocheng Li, </w:t>
       </w:r>
       <w:r>
         <w:rPr>
@@ -1991,31 +1696,7 @@
           <w:sz w:val="21"/>
           <w:szCs w:val="21"/>
         </w:rPr>
-        <w:t xml:space="preserve"> </w:t>
-      </w:r>
-      <w:r>
-        <w:rPr>
-          <w:rFonts w:eastAsiaTheme="minorEastAsia" w:hint="eastAsia"/>
-          <w:bCs/>
-          <w:i/>
-          <w:iCs/>
-          <w:kern w:val="2"/>
-          <w:sz w:val="21"/>
-          <w:szCs w:val="21"/>
-        </w:rPr>
-        <w:t>ICML</w:t>
-      </w:r>
-      <w:r>
-        <w:rPr>
-          <w:rFonts w:eastAsiaTheme="minorEastAsia"/>
-          <w:bCs/>
-          <w:i/>
-          <w:iCs/>
-          <w:kern w:val="2"/>
-          <w:sz w:val="21"/>
-          <w:szCs w:val="21"/>
-        </w:rPr>
-        <w:t xml:space="preserve"> 2023</w:t>
+        <w:t>NeurIPS 2023</w:t>
       </w:r>
       <w:r>
         <w:rPr>
@@ -2085,7 +1766,47 @@
           <w:sz w:val="21"/>
           <w:szCs w:val="21"/>
         </w:rPr>
-        <w:t>Non-stationary Bandits with Knapsacks</w:t>
+        <w:t>Maximum Optimality Margin: A Unified Approach for</w:t>
+      </w:r>
+      <w:r>
+        <w:rPr>
+          <w:rFonts w:eastAsiaTheme="minorEastAsia"/>
+          <w:b/>
+          <w:kern w:val="2"/>
+          <w:sz w:val="21"/>
+          <w:szCs w:val="21"/>
+        </w:rPr>
+        <w:t xml:space="preserve"> </w:t>
+      </w:r>
+      <w:r>
+        <w:rPr>
+          <w:rFonts w:eastAsiaTheme="minorEastAsia"/>
+          <w:b/>
+          <w:kern w:val="2"/>
+          <w:sz w:val="21"/>
+          <w:szCs w:val="21"/>
+        </w:rPr>
+        <w:t>Contextual Linear Programming and Inverse Linear</w:t>
+      </w:r>
+      <w:r>
+        <w:rPr>
+          <w:rFonts w:eastAsiaTheme="minorEastAsia"/>
+          <w:b/>
+          <w:kern w:val="2"/>
+          <w:sz w:val="21"/>
+          <w:szCs w:val="21"/>
+        </w:rPr>
+        <w:t xml:space="preserve"> </w:t>
+      </w:r>
+      <w:r>
+        <w:rPr>
+          <w:rFonts w:eastAsiaTheme="minorEastAsia"/>
+          <w:b/>
+          <w:kern w:val="2"/>
+          <w:sz w:val="21"/>
+          <w:szCs w:val="21"/>
+        </w:rPr>
+        <w:t>Programming</w:t>
       </w:r>
     </w:p>
     <w:p>
@@ -2096,6 +1817,156 @@
         <w:ind w:leftChars="149" w:left="283"/>
         <w:rPr>
           <w:rStyle w:val="Hyperlink"/>
+          <w:iCs/>
+          <w:sz w:val="21"/>
+          <w:szCs w:val="21"/>
+        </w:rPr>
+      </w:pPr>
+      <w:r>
+        <w:rPr>
+          <w:rFonts w:eastAsiaTheme="minorEastAsia"/>
+          <w:bCs/>
+          <w:kern w:val="2"/>
+          <w:sz w:val="21"/>
+          <w:szCs w:val="21"/>
+        </w:rPr>
+        <w:t xml:space="preserve">Chunlin Sun*, </w:t>
+      </w:r>
+      <w:r>
+        <w:rPr>
+          <w:rFonts w:eastAsiaTheme="minorEastAsia"/>
+          <w:b/>
+          <w:kern w:val="2"/>
+          <w:sz w:val="21"/>
+          <w:szCs w:val="21"/>
+        </w:rPr>
+        <w:t>Shang Liu</w:t>
+      </w:r>
+      <w:r>
+        <w:rPr>
+          <w:rFonts w:eastAsiaTheme="minorEastAsia"/>
+          <w:bCs/>
+          <w:kern w:val="2"/>
+          <w:sz w:val="21"/>
+          <w:szCs w:val="21"/>
+        </w:rPr>
+        <w:t>*, Xiaocheng Li,</w:t>
+      </w:r>
+      <w:r>
+        <w:rPr>
+          <w:rFonts w:eastAsiaTheme="minorEastAsia"/>
+          <w:bCs/>
+          <w:i/>
+          <w:iCs/>
+          <w:kern w:val="2"/>
+          <w:sz w:val="21"/>
+          <w:szCs w:val="21"/>
+        </w:rPr>
+        <w:t xml:space="preserve"> </w:t>
+      </w:r>
+      <w:r>
+        <w:rPr>
+          <w:rFonts w:eastAsiaTheme="minorEastAsia" w:hint="eastAsia"/>
+          <w:bCs/>
+          <w:i/>
+          <w:iCs/>
+          <w:kern w:val="2"/>
+          <w:sz w:val="21"/>
+          <w:szCs w:val="21"/>
+        </w:rPr>
+        <w:t>ICML</w:t>
+      </w:r>
+      <w:r>
+        <w:rPr>
+          <w:rFonts w:eastAsiaTheme="minorEastAsia"/>
+          <w:bCs/>
+          <w:i/>
+          <w:iCs/>
+          <w:kern w:val="2"/>
+          <w:sz w:val="21"/>
+          <w:szCs w:val="21"/>
+        </w:rPr>
+        <w:t xml:space="preserve"> 2023</w:t>
+      </w:r>
+      <w:r>
+        <w:rPr>
+          <w:rFonts w:eastAsiaTheme="minorEastAsia"/>
+          <w:bCs/>
+          <w:kern w:val="2"/>
+          <w:sz w:val="21"/>
+          <w:szCs w:val="21"/>
+        </w:rPr>
+        <w:t>,</w:t>
+      </w:r>
+      <w:r>
+        <w:rPr>
+          <w:rFonts w:eastAsiaTheme="minorEastAsia" w:hint="eastAsia"/>
+          <w:bCs/>
+          <w:kern w:val="2"/>
+          <w:sz w:val="21"/>
+          <w:szCs w:val="21"/>
+        </w:rPr>
+        <w:t xml:space="preserve"> </w:t>
+      </w:r>
+      <w:hyperlink r:id="rId16" w:history="1">
+        <w:r>
+          <w:rPr>
+            <w:rStyle w:val="Hyperlink"/>
+            <w:iCs/>
+            <w:sz w:val="21"/>
+            <w:szCs w:val="21"/>
+          </w:rPr>
+          <w:t>arXiv</w:t>
+        </w:r>
+      </w:hyperlink>
+    </w:p>
+    <w:p>
+      <w:pPr>
+        <w:autoSpaceDE w:val="0"/>
+        <w:autoSpaceDN w:val="0"/>
+        <w:adjustRightInd w:val="0"/>
+        <w:ind w:leftChars="149" w:left="283"/>
+        <w:rPr>
+          <w:rStyle w:val="Hyperlink"/>
+          <w:iCs/>
+          <w:sz w:val="21"/>
+          <w:szCs w:val="21"/>
+        </w:rPr>
+      </w:pPr>
+    </w:p>
+    <w:p>
+      <w:pPr>
+        <w:autoSpaceDE w:val="0"/>
+        <w:autoSpaceDN w:val="0"/>
+        <w:adjustRightInd w:val="0"/>
+        <w:ind w:leftChars="149" w:left="283"/>
+        <w:rPr>
+          <w:rFonts w:eastAsiaTheme="minorEastAsia"/>
+          <w:b/>
+          <w:kern w:val="2"/>
+          <w:sz w:val="21"/>
+          <w:szCs w:val="21"/>
+        </w:rPr>
+      </w:pPr>
+      <w:r>
+        <w:rPr>
+          <w:rFonts w:eastAsiaTheme="minorEastAsia"/>
+          <w:b/>
+          <w:kern w:val="2"/>
+          <w:sz w:val="21"/>
+          <w:szCs w:val="21"/>
+        </w:rPr>
+        <w:t>Non-stationary Bandits with Knapsacks</w:t>
+      </w:r>
+    </w:p>
+    <w:p>
+      <w:pPr>
+        <w:autoSpaceDE w:val="0"/>
+        <w:autoSpaceDN w:val="0"/>
+        <w:adjustRightInd w:val="0"/>
+        <w:ind w:leftChars="149" w:left="283"/>
+        <w:rPr>
+          <w:rStyle w:val="Hyperlink"/>
           <w:rFonts w:eastAsiaTheme="minorEastAsia"/>
           <w:bCs/>
           <w:i/>
@@ -2135,51 +2006,7 @@
           <w:sz w:val="21"/>
           <w:szCs w:val="21"/>
         </w:rPr>
-        <w:t xml:space="preserve">, </w:t>
-      </w:r>
-      <w:proofErr w:type="spellStart"/>
-      <w:r>
-        <w:rPr>
-          <w:rFonts w:eastAsiaTheme="minorEastAsia"/>
-          <w:bCs/>
-          <w:kern w:val="2"/>
-          <w:sz w:val="21"/>
-          <w:szCs w:val="21"/>
-        </w:rPr>
-        <w:t>Jiashuo</w:t>
-      </w:r>
-      <w:proofErr w:type="spellEnd"/>
-      <w:r>
-        <w:rPr>
-          <w:rFonts w:eastAsiaTheme="minorEastAsia"/>
-          <w:bCs/>
-          <w:kern w:val="2"/>
-          <w:sz w:val="21"/>
-          <w:szCs w:val="21"/>
-        </w:rPr>
-        <w:t xml:space="preserve"> Jiang, </w:t>
-      </w:r>
-      <w:proofErr w:type="spellStart"/>
-      <w:r>
-        <w:rPr>
-          <w:rFonts w:eastAsiaTheme="minorEastAsia"/>
-          <w:bCs/>
-          <w:kern w:val="2"/>
-          <w:sz w:val="21"/>
-          <w:szCs w:val="21"/>
-        </w:rPr>
-        <w:t>Xiaocheng</w:t>
-      </w:r>
-      <w:proofErr w:type="spellEnd"/>
-      <w:r>
-        <w:rPr>
-          <w:rFonts w:eastAsiaTheme="minorEastAsia"/>
-          <w:bCs/>
-          <w:kern w:val="2"/>
-          <w:sz w:val="21"/>
-          <w:szCs w:val="21"/>
-        </w:rPr>
-        <w:t xml:space="preserve"> Li</w:t>
+        <w:t>, Jiashuo Jiang, Xiaocheng Li</w:t>
       </w:r>
       <w:r>
         <w:rPr>
@@ -2201,9 +2028,18 @@
           <w:sz w:val="21"/>
           <w:szCs w:val="21"/>
         </w:rPr>
-        <w:t xml:space="preserve"> </w:t>
-      </w:r>
-      <w:proofErr w:type="spellStart"/>
+        <w:t xml:space="preserve"> NeurIPS 2022</w:t>
+      </w:r>
+      <w:r>
+        <w:rPr>
+          <w:rFonts w:eastAsiaTheme="minorEastAsia"/>
+          <w:bCs/>
+          <w:kern w:val="2"/>
+          <w:sz w:val="21"/>
+          <w:szCs w:val="21"/>
+        </w:rPr>
+        <w:t>,</w:t>
+      </w:r>
       <w:r>
         <w:rPr>
           <w:rFonts w:eastAsiaTheme="minorEastAsia"/>
@@ -2214,44 +2050,9 @@
           <w:sz w:val="21"/>
           <w:szCs w:val="21"/>
         </w:rPr>
-        <w:t>NeurIPS</w:t>
-      </w:r>
-      <w:proofErr w:type="spellEnd"/>
-      <w:r>
-        <w:rPr>
-          <w:rFonts w:eastAsiaTheme="minorEastAsia"/>
-          <w:bCs/>
-          <w:i/>
-          <w:iCs/>
-          <w:kern w:val="2"/>
-          <w:sz w:val="21"/>
-          <w:szCs w:val="21"/>
-        </w:rPr>
-        <w:t xml:space="preserve"> 2022</w:t>
-      </w:r>
-      <w:r>
-        <w:rPr>
-          <w:rFonts w:eastAsiaTheme="minorEastAsia"/>
-          <w:bCs/>
-          <w:kern w:val="2"/>
-          <w:sz w:val="21"/>
-          <w:szCs w:val="21"/>
-        </w:rPr>
-        <w:t>,</w:t>
-      </w:r>
-      <w:r>
-        <w:rPr>
-          <w:rFonts w:eastAsiaTheme="minorEastAsia"/>
-          <w:bCs/>
-          <w:i/>
-          <w:iCs/>
-          <w:kern w:val="2"/>
-          <w:sz w:val="21"/>
-          <w:szCs w:val="21"/>
-        </w:rPr>
         <w:t xml:space="preserve"> </w:t>
       </w:r>
-      <w:hyperlink r:id="rId16" w:history="1">
+      <w:hyperlink r:id="rId17" w:history="1">
         <w:r>
           <w:rPr>
             <w:rStyle w:val="Hyperlink"/>
@@ -2350,29 +2151,7 @@
           <w:sz w:val="21"/>
           <w:szCs w:val="21"/>
         </w:rPr>
-        <w:t xml:space="preserve">, </w:t>
-      </w:r>
-      <w:proofErr w:type="spellStart"/>
-      <w:r>
-        <w:rPr>
-          <w:rFonts w:eastAsiaTheme="minorEastAsia"/>
-          <w:bCs/>
-          <w:kern w:val="2"/>
-          <w:sz w:val="21"/>
-          <w:szCs w:val="21"/>
-        </w:rPr>
-        <w:t>Xiaocheng</w:t>
-      </w:r>
-      <w:proofErr w:type="spellEnd"/>
-      <w:r>
-        <w:rPr>
-          <w:rFonts w:eastAsiaTheme="minorEastAsia"/>
-          <w:bCs/>
-          <w:kern w:val="2"/>
-          <w:sz w:val="21"/>
-          <w:szCs w:val="21"/>
-        </w:rPr>
-        <w:t xml:space="preserve"> Li</w:t>
+        <w:t>, Xiaocheng Li</w:t>
       </w:r>
       <w:r>
         <w:rPr>
@@ -2416,7 +2195,7 @@
         </w:rPr>
         <w:t xml:space="preserve"> </w:t>
       </w:r>
-      <w:hyperlink r:id="rId17" w:history="1">
+      <w:hyperlink r:id="rId18" w:history="1">
         <w:r>
           <w:rPr>
             <w:rStyle w:val="Hyperlink"/>
@@ -2438,7 +2217,6 @@
         <w:ind w:leftChars="149" w:left="283"/>
         <w:rPr>
           <w:rStyle w:val="Hyperlink"/>
-          <w:rFonts w:hint="eastAsia"/>
           <w:iCs/>
           <w:sz w:val="21"/>
           <w:szCs w:val="21"/>
@@ -2452,7 +2230,6 @@
         <w:adjustRightInd w:val="0"/>
         <w:ind w:leftChars="149" w:left="283"/>
         <w:rPr>
-          <w:rFonts w:hint="eastAsia"/>
           <w:i/>
           <w:iCs/>
           <w:sz w:val="22"/>
@@ -2500,6 +2277,7 @@
         <w:rPr>
           <w:sz w:val="22"/>
         </w:rPr>
+        <w:lastRenderedPageBreak/>
         <w:t xml:space="preserve">Dean’s List for Academic Excellence </w:t>
       </w:r>
       <w:r>
@@ -2539,7 +2317,6 @@
           <w:sz w:val="22"/>
         </w:rPr>
       </w:pPr>
-      <w:proofErr w:type="spellStart"/>
       <w:r>
         <w:rPr>
           <w:i/>
@@ -2548,7 +2325,6 @@
         </w:rPr>
         <w:t>Wusi</w:t>
       </w:r>
-      <w:proofErr w:type="spellEnd"/>
       <w:r>
         <w:rPr>
           <w:sz w:val="22"/>
@@ -2575,7 +2351,6 @@
           <w:sz w:val="25"/>
           <w:szCs w:val="25"/>
         </w:rPr>
-        <w:lastRenderedPageBreak/>
         <w:t>SEVICE</w:t>
       </w:r>
     </w:p>
@@ -2583,31 +2358,30 @@
       <w:pPr>
         <w:ind w:firstLine="420"/>
         <w:rPr>
-          <w:sz w:val="22"/>
-        </w:rPr>
-      </w:pPr>
-      <w:r>
-        <w:rPr>
           <w:rFonts w:hint="eastAsia"/>
           <w:sz w:val="22"/>
         </w:rPr>
-        <w:t xml:space="preserve">Reviewer: </w:t>
-      </w:r>
-      <w:proofErr w:type="spellStart"/>
+      </w:pPr>
       <w:r>
         <w:rPr>
           <w:rFonts w:hint="eastAsia"/>
           <w:sz w:val="22"/>
         </w:rPr>
-        <w:t>NeurIPS</w:t>
-      </w:r>
-      <w:proofErr w:type="spellEnd"/>
+        <w:t>Reviewer: NeurIPS</w:t>
+      </w:r>
       <w:r>
         <w:rPr>
           <w:rFonts w:hint="eastAsia"/>
           <w:sz w:val="22"/>
         </w:rPr>
         <w:t>, ICLR, AISTATS</w:t>
+      </w:r>
+      <w:r>
+        <w:rPr>
+          <w:rFonts w:hint="eastAsia"/>
+          <w:sz w:val="22"/>
+        </w:rPr>
+        <w:t>, ICML, TMLR</w:t>
       </w:r>
     </w:p>
     <w:p>
@@ -2658,7 +2432,7 @@
 </file>
 
 <file path=word/endnotes.xml><?xml version="1.0" encoding="utf-8"?>
-<w:endnotes xmlns:wpc="http://schemas.microsoft.com/office/word/2010/wordprocessingCanvas" xmlns:cx="http://schemas.microsoft.com/office/drawing/2014/chartex" xmlns:cx1="http://schemas.microsoft.com/office/drawing/2015/9/8/chartex" xmlns:cx2="http://schemas.microsoft.com/office/drawing/2015/10/21/chartex" xmlns:cx3="http://schemas.microsoft.com/office/drawing/2016/5/9/chartex" xmlns:cx4="http://schemas.microsoft.com/office/drawing/2016/5/10/chartex" xmlns:cx5="http://schemas.microsoft.com/office/drawing/2016/5/11/chartex" xmlns:cx6="http://schemas.microsoft.com/office/drawing/2016/5/12/chartex" xmlns:cx7="http://schemas.microsoft.com/office/drawing/2016/5/13/chartex" xmlns:cx8="http://schemas.microsoft.com/office/drawing/2016/5/14/chartex" xmlns:mc="http://schemas.openxmlformats.org/markup-compatibility/2006" xmlns:aink="http://schemas.microsoft.com/office/drawing/2016/ink" xmlns:am3d="http://schemas.microsoft.com/office/drawing/2017/model3d" xmlns:o="urn:schemas-microsoft-com:office:office" xmlns:oel="http://schemas.microsoft.com/office/2019/extlst" xmlns:r="http://schemas.openxmlformats.org/officeDocument/2006/relationships" xmlns:m="http://schemas.openxmlformats.org/officeDocument/2006/math" xmlns:v="urn:schemas-microsoft-com:vml" xmlns:wp14="http://schemas.microsoft.com/office/word/2010/wordprocessingDrawing" xmlns:wp="http://schemas.openxmlformats.org/drawingml/2006/wordprocessingDrawing" xmlns:w10="urn:schemas-microsoft-com:office:word" xmlns:w="http://schemas.openxmlformats.org/wordprocessingml/2006/main" xmlns:w14="http://schemas.microsoft.com/office/word/2010/wordml" xmlns:w15="http://schemas.microsoft.com/office/word/2012/wordml" xmlns:w16cex="http://schemas.microsoft.com/office/word/2018/wordml/cex" xmlns:w16cid="http://schemas.microsoft.com/office/word/2016/wordml/cid" xmlns:w16="http://schemas.microsoft.com/office/word/2018/wordml" xmlns:w16du="http://schemas.microsoft.com/office/word/2023/wordml/word16du" xmlns:w16sdtdh="http://schemas.microsoft.com/office/word/2020/wordml/sdtdatahash" xmlns:w16se="http://schemas.microsoft.com/office/word/2015/wordml/symex" xmlns:wpg="http://schemas.microsoft.com/office/word/2010/wordprocessingGroup" xmlns:wpi="http://schemas.microsoft.com/office/word/2010/wordprocessingInk" xmlns:wne="http://schemas.microsoft.com/office/word/2006/wordml" xmlns:wps="http://schemas.microsoft.com/office/word/2010/wordprocessingShape" mc:Ignorable="w14 w15 w16se w16cid w16 w16cex w16sdtdh w16du wp14">
+<w:endnotes xmlns:wpc="http://schemas.microsoft.com/office/word/2010/wordprocessingCanvas" xmlns:cx="http://schemas.microsoft.com/office/drawing/2014/chartex" xmlns:cx1="http://schemas.microsoft.com/office/drawing/2015/9/8/chartex" xmlns:cx2="http://schemas.microsoft.com/office/drawing/2015/10/21/chartex" xmlns:cx3="http://schemas.microsoft.com/office/drawing/2016/5/9/chartex" xmlns:cx4="http://schemas.microsoft.com/office/drawing/2016/5/10/chartex" xmlns:cx5="http://schemas.microsoft.com/office/drawing/2016/5/11/chartex" xmlns:cx6="http://schemas.microsoft.com/office/drawing/2016/5/12/chartex" xmlns:cx7="http://schemas.microsoft.com/office/drawing/2016/5/13/chartex" xmlns:cx8="http://schemas.microsoft.com/office/drawing/2016/5/14/chartex" xmlns:mc="http://schemas.openxmlformats.org/markup-compatibility/2006" xmlns:aink="http://schemas.microsoft.com/office/drawing/2016/ink" xmlns:am3d="http://schemas.microsoft.com/office/drawing/2017/model3d" xmlns:o="urn:schemas-microsoft-com:office:office" xmlns:oel="http://schemas.microsoft.com/office/2019/extlst" xmlns:r="http://schemas.openxmlformats.org/officeDocument/2006/relationships" xmlns:m="http://schemas.openxmlformats.org/officeDocument/2006/math" xmlns:v="urn:schemas-microsoft-com:vml" xmlns:wp14="http://schemas.microsoft.com/office/word/2010/wordprocessingDrawing" xmlns:wp="http://schemas.openxmlformats.org/drawingml/2006/wordprocessingDrawing" xmlns:w10="urn:schemas-microsoft-com:office:word" xmlns:w="http://schemas.openxmlformats.org/wordprocessingml/2006/main" xmlns:w14="http://schemas.microsoft.com/office/word/2010/wordml" xmlns:w15="http://schemas.microsoft.com/office/word/2012/wordml" xmlns:w16cex="http://schemas.microsoft.com/office/word/2018/wordml/cex" xmlns:w16cid="http://schemas.microsoft.com/office/word/2016/wordml/cid" xmlns:w16="http://schemas.microsoft.com/office/word/2018/wordml" xmlns:w16du="http://schemas.microsoft.com/office/word/2023/wordml/word16du" xmlns:w16sdtdh="http://schemas.microsoft.com/office/word/2020/wordml/sdtdatahash" xmlns:w16sdtfl="http://schemas.microsoft.com/office/word/2024/wordml/sdtformatlock" xmlns:w16se="http://schemas.microsoft.com/office/word/2015/wordml/symex" xmlns:wpg="http://schemas.microsoft.com/office/word/2010/wordprocessingGroup" xmlns:wpi="http://schemas.microsoft.com/office/word/2010/wordprocessingInk" xmlns:wne="http://schemas.microsoft.com/office/word/2006/wordml" xmlns:wps="http://schemas.microsoft.com/office/word/2010/wordprocessingShape" mc:Ignorable="w14 w15 w16se w16cid w16 w16cex w16sdtdh w16sdtfl w16du wp14">
   <w:endnote w:type="separator" w:id="-1">
     <w:p>
       <w:r>
@@ -2677,7 +2451,7 @@
 </file>
 
 <file path=word/footnotes.xml><?xml version="1.0" encoding="utf-8"?>
-<w:footnotes xmlns:wpc="http://schemas.microsoft.com/office/word/2010/wordprocessingCanvas" xmlns:cx="http://schemas.microsoft.com/office/drawing/2014/chartex" xmlns:cx1="http://schemas.microsoft.com/office/drawing/2015/9/8/chartex" xmlns:cx2="http://schemas.microsoft.com/office/drawing/2015/10/21/chartex" xmlns:cx3="http://schemas.microsoft.com/office/drawing/2016/5/9/chartex" xmlns:cx4="http://schemas.microsoft.com/office/drawing/2016/5/10/chartex" xmlns:cx5="http://schemas.microsoft.com/office/drawing/2016/5/11/chartex" xmlns:cx6="http://schemas.microsoft.com/office/drawing/2016/5/12/chartex" xmlns:cx7="http://schemas.microsoft.com/office/drawing/2016/5/13/chartex" xmlns:cx8="http://schemas.microsoft.com/office/drawing/2016/5/14/chartex" xmlns:mc="http://schemas.openxmlformats.org/markup-compatibility/2006" xmlns:aink="http://schemas.microsoft.com/office/drawing/2016/ink" xmlns:am3d="http://schemas.microsoft.com/office/drawing/2017/model3d" xmlns:o="urn:schemas-microsoft-com:office:office" xmlns:oel="http://schemas.microsoft.com/office/2019/extlst" xmlns:r="http://schemas.openxmlformats.org/officeDocument/2006/relationships" xmlns:m="http://schemas.openxmlformats.org/officeDocument/2006/math" xmlns:v="urn:schemas-microsoft-com:vml" xmlns:wp14="http://schemas.microsoft.com/office/word/2010/wordprocessingDrawing" xmlns:wp="http://schemas.openxmlformats.org/drawingml/2006/wordprocessingDrawing" xmlns:w10="urn:schemas-microsoft-com:office:word" xmlns:w="http://schemas.openxmlformats.org/wordprocessingml/2006/main" xmlns:w14="http://schemas.microsoft.com/office/word/2010/wordml" xmlns:w15="http://schemas.microsoft.com/office/word/2012/wordml" xmlns:w16cex="http://schemas.microsoft.com/office/word/2018/wordml/cex" xmlns:w16cid="http://schemas.microsoft.com/office/word/2016/wordml/cid" xmlns:w16="http://schemas.microsoft.com/office/word/2018/wordml" xmlns:w16du="http://schemas.microsoft.com/office/word/2023/wordml/word16du" xmlns:w16sdtdh="http://schemas.microsoft.com/office/word/2020/wordml/sdtdatahash" xmlns:w16se="http://schemas.microsoft.com/office/word/2015/wordml/symex" xmlns:wpg="http://schemas.microsoft.com/office/word/2010/wordprocessingGroup" xmlns:wpi="http://schemas.microsoft.com/office/word/2010/wordprocessingInk" xmlns:wne="http://schemas.microsoft.com/office/word/2006/wordml" xmlns:wps="http://schemas.microsoft.com/office/word/2010/wordprocessingShape" mc:Ignorable="w14 w15 w16se w16cid w16 w16cex w16sdtdh w16du wp14">
+<w:footnotes xmlns:wpc="http://schemas.microsoft.com/office/word/2010/wordprocessingCanvas" xmlns:cx="http://schemas.microsoft.com/office/drawing/2014/chartex" xmlns:cx1="http://schemas.microsoft.com/office/drawing/2015/9/8/chartex" xmlns:cx2="http://schemas.microsoft.com/office/drawing/2015/10/21/chartex" xmlns:cx3="http://schemas.microsoft.com/office/drawing/2016/5/9/chartex" xmlns:cx4="http://schemas.microsoft.com/office/drawing/2016/5/10/chartex" xmlns:cx5="http://schemas.microsoft.com/office/drawing/2016/5/11/chartex" xmlns:cx6="http://schemas.microsoft.com/office/drawing/2016/5/12/chartex" xmlns:cx7="http://schemas.microsoft.com/office/drawing/2016/5/13/chartex" xmlns:cx8="http://schemas.microsoft.com/office/drawing/2016/5/14/chartex" xmlns:mc="http://schemas.openxmlformats.org/markup-compatibility/2006" xmlns:aink="http://schemas.microsoft.com/office/drawing/2016/ink" xmlns:am3d="http://schemas.microsoft.com/office/drawing/2017/model3d" xmlns:o="urn:schemas-microsoft-com:office:office" xmlns:oel="http://schemas.microsoft.com/office/2019/extlst" xmlns:r="http://schemas.openxmlformats.org/officeDocument/2006/relationships" xmlns:m="http://schemas.openxmlformats.org/officeDocument/2006/math" xmlns:v="urn:schemas-microsoft-com:vml" xmlns:wp14="http://schemas.microsoft.com/office/word/2010/wordprocessingDrawing" xmlns:wp="http://schemas.openxmlformats.org/drawingml/2006/wordprocessingDrawing" xmlns:w10="urn:schemas-microsoft-com:office:word" xmlns:w="http://schemas.openxmlformats.org/wordprocessingml/2006/main" xmlns:w14="http://schemas.microsoft.com/office/word/2010/wordml" xmlns:w15="http://schemas.microsoft.com/office/word/2012/wordml" xmlns:w16cex="http://schemas.microsoft.com/office/word/2018/wordml/cex" xmlns:w16cid="http://schemas.microsoft.com/office/word/2016/wordml/cid" xmlns:w16="http://schemas.microsoft.com/office/word/2018/wordml" xmlns:w16du="http://schemas.microsoft.com/office/word/2023/wordml/word16du" xmlns:w16sdtdh="http://schemas.microsoft.com/office/word/2020/wordml/sdtdatahash" xmlns:w16sdtfl="http://schemas.microsoft.com/office/word/2024/wordml/sdtformatlock" xmlns:w16se="http://schemas.microsoft.com/office/word/2015/wordml/symex" xmlns:wpg="http://schemas.microsoft.com/office/word/2010/wordprocessingGroup" xmlns:wpi="http://schemas.microsoft.com/office/word/2010/wordprocessingInk" xmlns:wne="http://schemas.microsoft.com/office/word/2006/wordml" xmlns:wps="http://schemas.microsoft.com/office/word/2010/wordprocessingShape" mc:Ignorable="w14 w15 w16se w16cid w16 w16cex w16sdtdh w16sdtfl w16du wp14">
   <w:footnote w:type="separator" w:id="-1">
     <w:p>
       <w:r>
@@ -2696,7 +2470,7 @@
 </file>
 
 <file path=word/numbering.xml><?xml version="1.0" encoding="utf-8"?>
-<w:numbering xmlns:wpc="http://schemas.microsoft.com/office/word/2010/wordprocessingCanvas" xmlns:cx="http://schemas.microsoft.com/office/drawing/2014/chartex" xmlns:cx1="http://schemas.microsoft.com/office/drawing/2015/9/8/chartex" xmlns:cx2="http://schemas.microsoft.com/office/drawing/2015/10/21/chartex" xmlns:cx3="http://schemas.microsoft.com/office/drawing/2016/5/9/chartex" xmlns:cx4="http://schemas.microsoft.com/office/drawing/2016/5/10/chartex" xmlns:cx5="http://schemas.microsoft.com/office/drawing/2016/5/11/chartex" xmlns:cx6="http://schemas.microsoft.com/office/drawing/2016/5/12/chartex" xmlns:cx7="http://schemas.microsoft.com/office/drawing/2016/5/13/chartex" xmlns:cx8="http://schemas.microsoft.com/office/drawing/2016/5/14/chartex" xmlns:mc="http://schemas.openxmlformats.org/markup-compatibility/2006" xmlns:aink="http://schemas.microsoft.com/office/drawing/2016/ink" xmlns:am3d="http://schemas.microsoft.com/office/drawing/2017/model3d" xmlns:o="urn:schemas-microsoft-com:office:office" xmlns:oel="http://schemas.microsoft.com/office/2019/extlst" xmlns:r="http://schemas.openxmlformats.org/officeDocument/2006/relationships" xmlns:m="http://schemas.openxmlformats.org/officeDocument/2006/math" xmlns:v="urn:schemas-microsoft-com:vml" xmlns:wp14="http://schemas.microsoft.com/office/word/2010/wordprocessingDrawing" xmlns:wp="http://schemas.openxmlformats.org/drawingml/2006/wordprocessingDrawing" xmlns:w10="urn:schemas-microsoft-com:office:word" xmlns:w="http://schemas.openxmlformats.org/wordprocessingml/2006/main" xmlns:w14="http://schemas.microsoft.com/office/word/2010/wordml" xmlns:w15="http://schemas.microsoft.com/office/word/2012/wordml" xmlns:w16cex="http://schemas.microsoft.com/office/word/2018/wordml/cex" xmlns:w16cid="http://schemas.microsoft.com/office/word/2016/wordml/cid" xmlns:w16="http://schemas.microsoft.com/office/word/2018/wordml" xmlns:w16du="http://schemas.microsoft.com/office/word/2023/wordml/word16du" xmlns:w16sdtdh="http://schemas.microsoft.com/office/word/2020/wordml/sdtdatahash" xmlns:w16se="http://schemas.microsoft.com/office/word/2015/wordml/symex" xmlns:wpg="http://schemas.microsoft.com/office/word/2010/wordprocessingGroup" xmlns:wpi="http://schemas.microsoft.com/office/word/2010/wordprocessingInk" xmlns:wne="http://schemas.microsoft.com/office/word/2006/wordml" xmlns:wps="http://schemas.microsoft.com/office/word/2010/wordprocessingShape" mc:Ignorable="w14 w15 w16se w16cid w16 w16cex w16sdtdh w16du wp14">
+<w:numbering xmlns:wpc="http://schemas.microsoft.com/office/word/2010/wordprocessingCanvas" xmlns:cx="http://schemas.microsoft.com/office/drawing/2014/chartex" xmlns:cx1="http://schemas.microsoft.com/office/drawing/2015/9/8/chartex" xmlns:cx2="http://schemas.microsoft.com/office/drawing/2015/10/21/chartex" xmlns:cx3="http://schemas.microsoft.com/office/drawing/2016/5/9/chartex" xmlns:cx4="http://schemas.microsoft.com/office/drawing/2016/5/10/chartex" xmlns:cx5="http://schemas.microsoft.com/office/drawing/2016/5/11/chartex" xmlns:cx6="http://schemas.microsoft.com/office/drawing/2016/5/12/chartex" xmlns:cx7="http://schemas.microsoft.com/office/drawing/2016/5/13/chartex" xmlns:cx8="http://schemas.microsoft.com/office/drawing/2016/5/14/chartex" xmlns:mc="http://schemas.openxmlformats.org/markup-compatibility/2006" xmlns:aink="http://schemas.microsoft.com/office/drawing/2016/ink" xmlns:am3d="http://schemas.microsoft.com/office/drawing/2017/model3d" xmlns:o="urn:schemas-microsoft-com:office:office" xmlns:oel="http://schemas.microsoft.com/office/2019/extlst" xmlns:r="http://schemas.openxmlformats.org/officeDocument/2006/relationships" xmlns:m="http://schemas.openxmlformats.org/officeDocument/2006/math" xmlns:v="urn:schemas-microsoft-com:vml" xmlns:wp14="http://schemas.microsoft.com/office/word/2010/wordprocessingDrawing" xmlns:wp="http://schemas.openxmlformats.org/drawingml/2006/wordprocessingDrawing" xmlns:w10="urn:schemas-microsoft-com:office:word" xmlns:w="http://schemas.openxmlformats.org/wordprocessingml/2006/main" xmlns:w14="http://schemas.microsoft.com/office/word/2010/wordml" xmlns:w15="http://schemas.microsoft.com/office/word/2012/wordml" xmlns:w16cex="http://schemas.microsoft.com/office/word/2018/wordml/cex" xmlns:w16cid="http://schemas.microsoft.com/office/word/2016/wordml/cid" xmlns:w16="http://schemas.microsoft.com/office/word/2018/wordml" xmlns:w16du="http://schemas.microsoft.com/office/word/2023/wordml/word16du" xmlns:w16sdtdh="http://schemas.microsoft.com/office/word/2020/wordml/sdtdatahash" xmlns:w16sdtfl="http://schemas.microsoft.com/office/word/2024/wordml/sdtformatlock" xmlns:w16se="http://schemas.microsoft.com/office/word/2015/wordml/symex" xmlns:wpg="http://schemas.microsoft.com/office/word/2010/wordprocessingGroup" xmlns:wpi="http://schemas.microsoft.com/office/word/2010/wordprocessingInk" xmlns:wne="http://schemas.microsoft.com/office/word/2006/wordml" xmlns:wps="http://schemas.microsoft.com/office/word/2010/wordprocessingShape" mc:Ignorable="w14 w15 w16se w16cid w16 w16cex w16sdtdh w16sdtfl w16du wp14">
   <w:abstractNum w:abstractNumId="0" w15:restartNumberingAfterBreak="0">
     <w:nsid w:val="000E54F5"/>
     <w:multiLevelType w:val="hybridMultilevel"/>
@@ -3466,7 +3240,7 @@
 </file>
 
 <file path=word/styles.xml><?xml version="1.0" encoding="utf-8"?>
-<w:styles xmlns:mc="http://schemas.openxmlformats.org/markup-compatibility/2006" xmlns:r="http://schemas.openxmlformats.org/officeDocument/2006/relationships" xmlns:w="http://schemas.openxmlformats.org/wordprocessingml/2006/main" xmlns:w14="http://schemas.microsoft.com/office/word/2010/wordml" xmlns:w15="http://schemas.microsoft.com/office/word/2012/wordml" xmlns:w16cex="http://schemas.microsoft.com/office/word/2018/wordml/cex" xmlns:w16cid="http://schemas.microsoft.com/office/word/2016/wordml/cid" xmlns:w16="http://schemas.microsoft.com/office/word/2018/wordml" xmlns:w16du="http://schemas.microsoft.com/office/word/2023/wordml/word16du" xmlns:w16sdtdh="http://schemas.microsoft.com/office/word/2020/wordml/sdtdatahash" xmlns:w16se="http://schemas.microsoft.com/office/word/2015/wordml/symex" mc:Ignorable="w14 w15 w16se w16cid w16 w16cex w16sdtdh w16du">
+<w:styles xmlns:mc="http://schemas.openxmlformats.org/markup-compatibility/2006" xmlns:r="http://schemas.openxmlformats.org/officeDocument/2006/relationships" xmlns:w="http://schemas.openxmlformats.org/wordprocessingml/2006/main" xmlns:w14="http://schemas.microsoft.com/office/word/2010/wordml" xmlns:w15="http://schemas.microsoft.com/office/word/2012/wordml" xmlns:w16cex="http://schemas.microsoft.com/office/word/2018/wordml/cex" xmlns:w16cid="http://schemas.microsoft.com/office/word/2016/wordml/cid" xmlns:w16="http://schemas.microsoft.com/office/word/2018/wordml" xmlns:w16du="http://schemas.microsoft.com/office/word/2023/wordml/word16du" xmlns:w16sdtdh="http://schemas.microsoft.com/office/word/2020/wordml/sdtdatahash" xmlns:w16sdtfl="http://schemas.microsoft.com/office/word/2024/wordml/sdtformatlock" xmlns:w16se="http://schemas.microsoft.com/office/word/2015/wordml/symex" mc:Ignorable="w14 w15 w16se w16cid w16 w16cex w16sdtdh w16sdtfl w16du">
   <w:docDefaults>
     <w:rPrDefault>
       <w:rPr>

</xml_diff>

<commit_message>
Updated bio and publication list
Updated a new preprint. Also updated the visiting information and the job market information.
</commit_message>
<xml_diff>
--- a/CV.docx
+++ b/CV.docx
@@ -686,6 +686,7 @@
       <w:pPr>
         <w:ind w:left="330"/>
         <w:rPr>
+          <w:rFonts w:hint="eastAsia"/>
           <w:sz w:val="28"/>
           <w:szCs w:val="22"/>
         </w:rPr>
@@ -803,7 +804,7 @@
           <w:sz w:val="24"/>
           <w:szCs w:val="24"/>
         </w:rPr>
-        <w:t>Incentivizing High-Quality Human Annotations with Golden Questions</w:t>
+        <w:t>Wasserstein Distributionally Robust Regret Optimization for Reinforcement Learning from Human Feedback</w:t>
       </w:r>
     </w:p>
     <w:p>
@@ -813,13 +814,42 @@
         <w:adjustRightInd w:val="0"/>
         <w:ind w:leftChars="149" w:left="283"/>
         <w:rPr>
-          <w:iCs/>
-          <w:color w:val="0000FF"/>
-          <w:sz w:val="24"/>
-          <w:szCs w:val="24"/>
-          <w:u w:val="single"/>
-        </w:rPr>
-      </w:pPr>
+          <w:rStyle w:val="Hyperlink"/>
+          <w:iCs/>
+          <w:sz w:val="24"/>
+          <w:szCs w:val="24"/>
+        </w:rPr>
+      </w:pPr>
+      <w:r>
+        <w:rPr>
+          <w:rFonts w:eastAsiaTheme="minorEastAsia" w:hint="eastAsia"/>
+          <w:bCs/>
+          <w:kern w:val="2"/>
+          <w:sz w:val="24"/>
+          <w:szCs w:val="24"/>
+        </w:rPr>
+        <w:t>Yikai</w:t>
+      </w:r>
+      <w:r>
+        <w:rPr>
+          <w:rFonts w:eastAsiaTheme="minorEastAsia" w:hint="eastAsia"/>
+          <w:bCs/>
+          <w:kern w:val="2"/>
+          <w:sz w:val="24"/>
+          <w:szCs w:val="24"/>
+        </w:rPr>
+        <w:t xml:space="preserve"> Wang*,</w:t>
+      </w:r>
+      <w:r>
+        <w:rPr>
+          <w:rFonts w:eastAsiaTheme="minorEastAsia" w:hint="eastAsia"/>
+          <w:bCs/>
+          <w:kern w:val="2"/>
+          <w:sz w:val="24"/>
+          <w:szCs w:val="24"/>
+        </w:rPr>
+        <w:t xml:space="preserve"> </w:t>
+      </w:r>
       <w:r>
         <w:rPr>
           <w:rFonts w:eastAsiaTheme="minorEastAsia"/>
@@ -832,6 +862,16 @@
       </w:r>
       <w:r>
         <w:rPr>
+          <w:rFonts w:eastAsiaTheme="minorEastAsia" w:hint="eastAsia"/>
+          <w:b/>
+          <w:kern w:val="2"/>
+          <w:sz w:val="24"/>
+          <w:szCs w:val="24"/>
+        </w:rPr>
+        <w:t>*</w:t>
+      </w:r>
+      <w:r>
+        <w:rPr>
           <w:rFonts w:eastAsiaTheme="minorEastAsia"/>
           <w:bCs/>
           <w:kern w:val="2"/>
@@ -858,27 +898,17 @@
           <w:sz w:val="24"/>
           <w:szCs w:val="24"/>
         </w:rPr>
-        <w:t xml:space="preserve">Zhongze Cai, </w:t>
-      </w:r>
-      <w:r>
-        <w:rPr>
-          <w:rFonts w:eastAsiaTheme="minorEastAsia" w:hint="eastAsia"/>
-          <w:bCs/>
-          <w:kern w:val="2"/>
-          <w:sz w:val="24"/>
-          <w:szCs w:val="24"/>
-        </w:rPr>
-        <w:t>Hanzhao Wang, Zhongyao Ma,</w:t>
-      </w:r>
-      <w:r>
-        <w:rPr>
-          <w:rFonts w:eastAsiaTheme="minorEastAsia"/>
-          <w:bCs/>
-          <w:kern w:val="2"/>
-          <w:sz w:val="24"/>
-          <w:szCs w:val="24"/>
-        </w:rPr>
-        <w:t xml:space="preserve"> Xiaocheng Li, </w:t>
+        <w:t>Jose Blanchet</w:t>
+      </w:r>
+      <w:r>
+        <w:rPr>
+          <w:rFonts w:eastAsiaTheme="minorEastAsia"/>
+          <w:bCs/>
+          <w:kern w:val="2"/>
+          <w:sz w:val="24"/>
+          <w:szCs w:val="24"/>
+        </w:rPr>
+        <w:t xml:space="preserve">, </w:t>
       </w:r>
       <w:hyperlink r:id="rId8" w:history="1">
         <w:r>
@@ -899,6 +929,7 @@
         <w:adjustRightInd w:val="0"/>
         <w:ind w:leftChars="149" w:left="283"/>
         <w:rPr>
+          <w:rFonts w:hint="eastAsia"/>
           <w:iCs/>
           <w:color w:val="0000FF"/>
           <w:sz w:val="24"/>
@@ -929,7 +960,7 @@
           <w:sz w:val="24"/>
           <w:szCs w:val="24"/>
         </w:rPr>
-        <w:t>How Humans Help LLMs: Assessing and Incentivizing Human Preference Annotators</w:t>
+        <w:t>Incentivizing High-Quality Human Annotations with Golden Questions</w:t>
       </w:r>
     </w:p>
     <w:p>
@@ -939,10 +970,11 @@
         <w:adjustRightInd w:val="0"/>
         <w:ind w:leftChars="149" w:left="283"/>
         <w:rPr>
-          <w:rStyle w:val="Hyperlink"/>
-          <w:iCs/>
-          <w:sz w:val="24"/>
-          <w:szCs w:val="24"/>
+          <w:iCs/>
+          <w:color w:val="0000FF"/>
+          <w:sz w:val="24"/>
+          <w:szCs w:val="24"/>
+          <w:u w:val="single"/>
         </w:rPr>
       </w:pPr>
       <w:r>
@@ -957,16 +989,6 @@
       </w:r>
       <w:r>
         <w:rPr>
-          <w:rFonts w:eastAsiaTheme="minorEastAsia" w:hint="eastAsia"/>
-          <w:b/>
-          <w:kern w:val="2"/>
-          <w:sz w:val="24"/>
-          <w:szCs w:val="24"/>
-        </w:rPr>
-        <w:t>*</w:t>
-      </w:r>
-      <w:r>
-        <w:rPr>
           <w:rFonts w:eastAsiaTheme="minorEastAsia"/>
           <w:bCs/>
           <w:kern w:val="2"/>
@@ -983,7 +1005,27 @@
           <w:sz w:val="24"/>
           <w:szCs w:val="24"/>
         </w:rPr>
-        <w:t xml:space="preserve"> Hanzhao Wang*, Zhongyao Ma,</w:t>
+        <w:t xml:space="preserve"> </w:t>
+      </w:r>
+      <w:r>
+        <w:rPr>
+          <w:rFonts w:eastAsiaTheme="minorEastAsia" w:hint="eastAsia"/>
+          <w:bCs/>
+          <w:kern w:val="2"/>
+          <w:sz w:val="24"/>
+          <w:szCs w:val="24"/>
+        </w:rPr>
+        <w:t xml:space="preserve">Zhongze Cai, </w:t>
+      </w:r>
+      <w:r>
+        <w:rPr>
+          <w:rFonts w:eastAsiaTheme="minorEastAsia" w:hint="eastAsia"/>
+          <w:bCs/>
+          <w:kern w:val="2"/>
+          <w:sz w:val="24"/>
+          <w:szCs w:val="24"/>
+        </w:rPr>
+        <w:t>Hanzhao Wang, Zhongyao Ma,</w:t>
       </w:r>
       <w:r>
         <w:rPr>
@@ -994,28 +1036,6 @@
           <w:szCs w:val="24"/>
         </w:rPr>
         <w:t xml:space="preserve"> Xiaocheng Li, </w:t>
-      </w:r>
-      <w:r>
-        <w:rPr>
-          <w:rFonts w:eastAsiaTheme="minorEastAsia" w:hint="eastAsia"/>
-          <w:bCs/>
-          <w:i/>
-          <w:iCs/>
-          <w:kern w:val="2"/>
-          <w:sz w:val="24"/>
-          <w:szCs w:val="24"/>
-        </w:rPr>
-        <w:t>under Major Revision at Management Science,</w:t>
-      </w:r>
-      <w:r>
-        <w:rPr>
-          <w:rFonts w:eastAsiaTheme="minorEastAsia" w:hint="eastAsia"/>
-          <w:bCs/>
-          <w:kern w:val="2"/>
-          <w:sz w:val="24"/>
-          <w:szCs w:val="24"/>
-        </w:rPr>
-        <w:t xml:space="preserve"> </w:t>
       </w:r>
       <w:hyperlink r:id="rId9" w:history="1">
         <w:r>
@@ -1066,7 +1086,7 @@
           <w:sz w:val="24"/>
           <w:szCs w:val="24"/>
         </w:rPr>
-        <w:t>Reward Modeling with Ordinal Feedback: Wisdom of the Crowd</w:t>
+        <w:t>How Humans Help LLMs: Assessing and Incentivizing Human Preference Annotators</w:t>
       </w:r>
     </w:p>
     <w:p>
@@ -1120,53 +1140,33 @@
           <w:sz w:val="24"/>
           <w:szCs w:val="24"/>
         </w:rPr>
-        <w:t xml:space="preserve"> Yu Pan*, Guanting Chen,</w:t>
-      </w:r>
-      <w:r>
-        <w:rPr>
-          <w:rFonts w:eastAsiaTheme="minorEastAsia"/>
-          <w:bCs/>
-          <w:kern w:val="2"/>
-          <w:sz w:val="24"/>
-          <w:szCs w:val="24"/>
-        </w:rPr>
-        <w:t xml:space="preserve"> Xiaocheng Li,</w:t>
-      </w:r>
-      <w:r>
-        <w:rPr>
-          <w:rFonts w:eastAsiaTheme="minorEastAsia" w:hint="eastAsia"/>
-          <w:bCs/>
-          <w:kern w:val="2"/>
-          <w:sz w:val="24"/>
-          <w:szCs w:val="24"/>
-        </w:rPr>
-        <w:t xml:space="preserve"> </w:t>
-      </w:r>
-      <w:r>
-        <w:rPr>
-          <w:rFonts w:eastAsiaTheme="minorEastAsia" w:hint="eastAsia"/>
-          <w:bCs/>
-          <w:i/>
-          <w:iCs/>
-          <w:kern w:val="2"/>
-          <w:sz w:val="24"/>
-          <w:szCs w:val="24"/>
-        </w:rPr>
-        <w:t>ICML 2025</w:t>
-      </w:r>
-      <w:r>
-        <w:rPr>
-          <w:rFonts w:eastAsiaTheme="minorEastAsia" w:hint="eastAsia"/>
-          <w:bCs/>
-          <w:kern w:val="2"/>
-          <w:sz w:val="24"/>
-          <w:szCs w:val="24"/>
-        </w:rPr>
-        <w:t>,</w:t>
-      </w:r>
-      <w:r>
-        <w:rPr>
-          <w:rFonts w:eastAsiaTheme="minorEastAsia"/>
+        <w:t xml:space="preserve"> Hanzhao Wang*, Zhongyao Ma,</w:t>
+      </w:r>
+      <w:r>
+        <w:rPr>
+          <w:rFonts w:eastAsiaTheme="minorEastAsia"/>
+          <w:bCs/>
+          <w:kern w:val="2"/>
+          <w:sz w:val="24"/>
+          <w:szCs w:val="24"/>
+        </w:rPr>
+        <w:t xml:space="preserve"> Xiaocheng Li, </w:t>
+      </w:r>
+      <w:r>
+        <w:rPr>
+          <w:rFonts w:eastAsiaTheme="minorEastAsia" w:hint="eastAsia"/>
+          <w:bCs/>
+          <w:i/>
+          <w:iCs/>
+          <w:kern w:val="2"/>
+          <w:sz w:val="24"/>
+          <w:szCs w:val="24"/>
+        </w:rPr>
+        <w:t>under Major Revision at Management Science,</w:t>
+      </w:r>
+      <w:r>
+        <w:rPr>
+          <w:rFonts w:eastAsiaTheme="minorEastAsia" w:hint="eastAsia"/>
           <w:bCs/>
           <w:kern w:val="2"/>
           <w:sz w:val="24"/>
@@ -1193,10 +1193,11 @@
         <w:adjustRightInd w:val="0"/>
         <w:ind w:leftChars="149" w:left="283"/>
         <w:rPr>
-          <w:rStyle w:val="Hyperlink"/>
-          <w:iCs/>
-          <w:sz w:val="24"/>
-          <w:szCs w:val="24"/>
+          <w:iCs/>
+          <w:color w:val="0000FF"/>
+          <w:sz w:val="24"/>
+          <w:szCs w:val="24"/>
+          <w:u w:val="single"/>
         </w:rPr>
       </w:pPr>
     </w:p>
@@ -1222,7 +1223,7 @@
           <w:sz w:val="24"/>
           <w:szCs w:val="24"/>
         </w:rPr>
-        <w:t>Towards Better Understanding of In-Context Learning Ability from In-Context Uncertainty Quantification</w:t>
+        <w:t>Reward Modeling with Ordinal Feedback: Wisdom of the Crowd</w:t>
       </w:r>
     </w:p>
     <w:p>
@@ -1276,7 +1277,7 @@
           <w:sz w:val="24"/>
           <w:szCs w:val="24"/>
         </w:rPr>
-        <w:t xml:space="preserve"> Zhongze Cai*, Guanting Chen,</w:t>
+        <w:t xml:space="preserve"> Yu Pan*, Guanting Chen,</w:t>
       </w:r>
       <w:r>
         <w:rPr>
@@ -1308,91 +1309,7 @@
           <w:sz w:val="24"/>
           <w:szCs w:val="24"/>
         </w:rPr>
-        <w:t>T</w:t>
-      </w:r>
-      <w:r>
-        <w:rPr>
-          <w:rFonts w:eastAsiaTheme="minorEastAsia" w:hint="eastAsia"/>
-          <w:bCs/>
-          <w:i/>
-          <w:iCs/>
-          <w:kern w:val="2"/>
-          <w:sz w:val="24"/>
-          <w:szCs w:val="24"/>
-        </w:rPr>
-        <w:t xml:space="preserve">ransactions on </w:t>
-      </w:r>
-      <w:r>
-        <w:rPr>
-          <w:rFonts w:eastAsiaTheme="minorEastAsia" w:hint="eastAsia"/>
-          <w:bCs/>
-          <w:i/>
-          <w:iCs/>
-          <w:kern w:val="2"/>
-          <w:sz w:val="24"/>
-          <w:szCs w:val="24"/>
-        </w:rPr>
-        <w:t>M</w:t>
-      </w:r>
-      <w:r>
-        <w:rPr>
-          <w:rFonts w:eastAsiaTheme="minorEastAsia" w:hint="eastAsia"/>
-          <w:bCs/>
-          <w:i/>
-          <w:iCs/>
-          <w:kern w:val="2"/>
-          <w:sz w:val="24"/>
-          <w:szCs w:val="24"/>
-        </w:rPr>
-        <w:t xml:space="preserve">achine </w:t>
-      </w:r>
-      <w:r>
-        <w:rPr>
-          <w:rFonts w:eastAsiaTheme="minorEastAsia" w:hint="eastAsia"/>
-          <w:bCs/>
-          <w:i/>
-          <w:iCs/>
-          <w:kern w:val="2"/>
-          <w:sz w:val="24"/>
-          <w:szCs w:val="24"/>
-        </w:rPr>
-        <w:t>L</w:t>
-      </w:r>
-      <w:r>
-        <w:rPr>
-          <w:rFonts w:eastAsiaTheme="minorEastAsia" w:hint="eastAsia"/>
-          <w:bCs/>
-          <w:i/>
-          <w:iCs/>
-          <w:kern w:val="2"/>
-          <w:sz w:val="24"/>
-          <w:szCs w:val="24"/>
-        </w:rPr>
-        <w:t xml:space="preserve">earning </w:t>
-      </w:r>
-      <w:r>
-        <w:rPr>
-          <w:rFonts w:eastAsiaTheme="minorEastAsia" w:hint="eastAsia"/>
-          <w:bCs/>
-          <w:i/>
-          <w:iCs/>
-          <w:kern w:val="2"/>
-          <w:sz w:val="24"/>
-          <w:szCs w:val="24"/>
-        </w:rPr>
-        <w:t>R</w:t>
-      </w:r>
-      <w:r>
-        <w:rPr>
-          <w:rFonts w:eastAsiaTheme="minorEastAsia" w:hint="eastAsia"/>
-          <w:bCs/>
-          <w:i/>
-          <w:iCs/>
-          <w:kern w:val="2"/>
-          <w:sz w:val="24"/>
-          <w:szCs w:val="24"/>
-        </w:rPr>
-        <w:t>esearch</w:t>
+        <w:t>ICML 2025</w:t>
       </w:r>
       <w:r>
         <w:rPr>
@@ -1456,14 +1373,13 @@
       </w:pPr>
       <w:r>
         <w:rPr>
-          <w:rFonts w:eastAsiaTheme="minorEastAsia" w:hint="eastAsia"/>
-          <w:b/>
-          <w:kern w:val="2"/>
-          <w:sz w:val="24"/>
-          <w:szCs w:val="24"/>
-        </w:rPr>
-        <w:lastRenderedPageBreak/>
-        <w:t>Towards Better Statistical Understanding of Watermarking LLMs</w:t>
+          <w:rFonts w:eastAsiaTheme="minorEastAsia"/>
+          <w:b/>
+          <w:kern w:val="2"/>
+          <w:sz w:val="24"/>
+          <w:szCs w:val="24"/>
+        </w:rPr>
+        <w:t>Towards Better Understanding of In-Context Learning Ability from In-Context Uncertainty Quantification</w:t>
       </w:r>
     </w:p>
     <w:p>
@@ -1481,16 +1397,6 @@
       </w:pPr>
       <w:r>
         <w:rPr>
-          <w:rFonts w:eastAsiaTheme="minorEastAsia" w:hint="eastAsia"/>
-          <w:bCs/>
-          <w:kern w:val="2"/>
-          <w:sz w:val="24"/>
-          <w:szCs w:val="24"/>
-        </w:rPr>
-        <w:t xml:space="preserve">Zhongze Cai*, </w:t>
-      </w:r>
-      <w:r>
-        <w:rPr>
           <w:rFonts w:eastAsiaTheme="minorEastAsia"/>
           <w:b/>
           <w:kern w:val="2"/>
@@ -1527,51 +1433,143 @@
           <w:sz w:val="24"/>
           <w:szCs w:val="24"/>
         </w:rPr>
-        <w:t xml:space="preserve"> Hanzhao Wang*, Huaiyang Zhong,</w:t>
-      </w:r>
-      <w:r>
-        <w:rPr>
-          <w:rFonts w:eastAsiaTheme="minorEastAsia"/>
-          <w:bCs/>
-          <w:kern w:val="2"/>
-          <w:sz w:val="24"/>
-          <w:szCs w:val="24"/>
-        </w:rPr>
-        <w:t xml:space="preserve"> Xiaocheng Li, </w:t>
-      </w:r>
-      <w:r>
-        <w:rPr>
-          <w:rFonts w:eastAsiaTheme="minorEastAsia" w:hint="eastAsia"/>
-          <w:bCs/>
-          <w:i/>
-          <w:iCs/>
-          <w:kern w:val="2"/>
-          <w:sz w:val="24"/>
-          <w:szCs w:val="24"/>
-        </w:rPr>
-        <w:t>accepted</w:t>
-      </w:r>
-      <w:r>
-        <w:rPr>
-          <w:rFonts w:eastAsiaTheme="minorEastAsia"/>
-          <w:bCs/>
-          <w:i/>
-          <w:iCs/>
-          <w:kern w:val="2"/>
-          <w:sz w:val="24"/>
-          <w:szCs w:val="24"/>
-        </w:rPr>
-        <w:t xml:space="preserve"> at Journal of the American Statistical Association</w:t>
-      </w:r>
-      <w:r>
-        <w:rPr>
-          <w:rFonts w:eastAsiaTheme="minorEastAsia" w:hint="eastAsia"/>
-          <w:bCs/>
-          <w:kern w:val="2"/>
-          <w:sz w:val="24"/>
-          <w:szCs w:val="24"/>
-        </w:rPr>
-        <w:t xml:space="preserve">, </w:t>
+        <w:t xml:space="preserve"> Zhongze Cai*, Guanting Chen,</w:t>
+      </w:r>
+      <w:r>
+        <w:rPr>
+          <w:rFonts w:eastAsiaTheme="minorEastAsia"/>
+          <w:bCs/>
+          <w:kern w:val="2"/>
+          <w:sz w:val="24"/>
+          <w:szCs w:val="24"/>
+        </w:rPr>
+        <w:t xml:space="preserve"> Xiaocheng Li,</w:t>
+      </w:r>
+      <w:r>
+        <w:rPr>
+          <w:rFonts w:eastAsiaTheme="minorEastAsia" w:hint="eastAsia"/>
+          <w:bCs/>
+          <w:kern w:val="2"/>
+          <w:sz w:val="24"/>
+          <w:szCs w:val="24"/>
+        </w:rPr>
+        <w:t xml:space="preserve"> </w:t>
+      </w:r>
+      <w:r>
+        <w:rPr>
+          <w:rFonts w:eastAsiaTheme="minorEastAsia" w:hint="eastAsia"/>
+          <w:bCs/>
+          <w:i/>
+          <w:iCs/>
+          <w:kern w:val="2"/>
+          <w:sz w:val="24"/>
+          <w:szCs w:val="24"/>
+        </w:rPr>
+        <w:t>T</w:t>
+      </w:r>
+      <w:r>
+        <w:rPr>
+          <w:rFonts w:eastAsiaTheme="minorEastAsia" w:hint="eastAsia"/>
+          <w:bCs/>
+          <w:i/>
+          <w:iCs/>
+          <w:kern w:val="2"/>
+          <w:sz w:val="24"/>
+          <w:szCs w:val="24"/>
+        </w:rPr>
+        <w:t xml:space="preserve">ransactions on </w:t>
+      </w:r>
+      <w:r>
+        <w:rPr>
+          <w:rFonts w:eastAsiaTheme="minorEastAsia" w:hint="eastAsia"/>
+          <w:bCs/>
+          <w:i/>
+          <w:iCs/>
+          <w:kern w:val="2"/>
+          <w:sz w:val="24"/>
+          <w:szCs w:val="24"/>
+        </w:rPr>
+        <w:t>M</w:t>
+      </w:r>
+      <w:r>
+        <w:rPr>
+          <w:rFonts w:eastAsiaTheme="minorEastAsia" w:hint="eastAsia"/>
+          <w:bCs/>
+          <w:i/>
+          <w:iCs/>
+          <w:kern w:val="2"/>
+          <w:sz w:val="24"/>
+          <w:szCs w:val="24"/>
+        </w:rPr>
+        <w:t xml:space="preserve">achine </w:t>
+      </w:r>
+      <w:r>
+        <w:rPr>
+          <w:rFonts w:eastAsiaTheme="minorEastAsia" w:hint="eastAsia"/>
+          <w:bCs/>
+          <w:i/>
+          <w:iCs/>
+          <w:kern w:val="2"/>
+          <w:sz w:val="24"/>
+          <w:szCs w:val="24"/>
+        </w:rPr>
+        <w:t>L</w:t>
+      </w:r>
+      <w:r>
+        <w:rPr>
+          <w:rFonts w:eastAsiaTheme="minorEastAsia" w:hint="eastAsia"/>
+          <w:bCs/>
+          <w:i/>
+          <w:iCs/>
+          <w:kern w:val="2"/>
+          <w:sz w:val="24"/>
+          <w:szCs w:val="24"/>
+        </w:rPr>
+        <w:t xml:space="preserve">earning </w:t>
+      </w:r>
+      <w:r>
+        <w:rPr>
+          <w:rFonts w:eastAsiaTheme="minorEastAsia" w:hint="eastAsia"/>
+          <w:bCs/>
+          <w:i/>
+          <w:iCs/>
+          <w:kern w:val="2"/>
+          <w:sz w:val="24"/>
+          <w:szCs w:val="24"/>
+        </w:rPr>
+        <w:t>R</w:t>
+      </w:r>
+      <w:r>
+        <w:rPr>
+          <w:rFonts w:eastAsiaTheme="minorEastAsia" w:hint="eastAsia"/>
+          <w:bCs/>
+          <w:i/>
+          <w:iCs/>
+          <w:kern w:val="2"/>
+          <w:sz w:val="24"/>
+          <w:szCs w:val="24"/>
+        </w:rPr>
+        <w:t>esearch</w:t>
+      </w:r>
+      <w:r>
+        <w:rPr>
+          <w:rFonts w:eastAsiaTheme="minorEastAsia" w:hint="eastAsia"/>
+          <w:bCs/>
+          <w:kern w:val="2"/>
+          <w:sz w:val="24"/>
+          <w:szCs w:val="24"/>
+        </w:rPr>
+        <w:t>,</w:t>
+      </w:r>
+      <w:r>
+        <w:rPr>
+          <w:rFonts w:eastAsiaTheme="minorEastAsia"/>
+          <w:bCs/>
+          <w:kern w:val="2"/>
+          <w:sz w:val="24"/>
+          <w:szCs w:val="24"/>
+        </w:rPr>
+        <w:t xml:space="preserve"> </w:t>
       </w:r>
       <w:hyperlink r:id="rId12" w:history="1">
         <w:r>
@@ -1615,13 +1613,13 @@
       </w:pPr>
       <w:r>
         <w:rPr>
-          <w:rFonts w:eastAsiaTheme="minorEastAsia"/>
-          <w:b/>
-          <w:kern w:val="2"/>
-          <w:sz w:val="24"/>
-          <w:szCs w:val="24"/>
-        </w:rPr>
-        <w:t>When No-Rejection Learning is Consistent for Regression with Rejection</w:t>
+          <w:rFonts w:eastAsiaTheme="minorEastAsia" w:hint="eastAsia"/>
+          <w:b/>
+          <w:kern w:val="2"/>
+          <w:sz w:val="24"/>
+          <w:szCs w:val="24"/>
+        </w:rPr>
+        <w:t>Towards Better Statistical Understanding of Watermarking LLMs</w:t>
       </w:r>
     </w:p>
     <w:p>
@@ -1645,49 +1643,27 @@
           <w:sz w:val="24"/>
           <w:szCs w:val="24"/>
         </w:rPr>
-        <w:t>X</w:t>
-      </w:r>
-      <w:r>
-        <w:rPr>
-          <w:rFonts w:eastAsiaTheme="minorEastAsia"/>
-          <w:bCs/>
-          <w:kern w:val="2"/>
-          <w:sz w:val="24"/>
-          <w:szCs w:val="24"/>
-        </w:rPr>
-        <w:t>iaocheng Li,</w:t>
-      </w:r>
-      <w:r>
-        <w:rPr>
-          <w:rFonts w:eastAsiaTheme="minorEastAsia"/>
-          <w:b/>
-          <w:kern w:val="2"/>
-          <w:sz w:val="24"/>
-          <w:szCs w:val="24"/>
-        </w:rPr>
-        <w:t xml:space="preserve"> Shang Liu</w:t>
-      </w:r>
-      <w:r>
-        <w:rPr>
-          <w:rFonts w:eastAsiaTheme="minorEastAsia"/>
-          <w:bCs/>
-          <w:kern w:val="2"/>
-          <w:sz w:val="24"/>
-          <w:szCs w:val="24"/>
-        </w:rPr>
-        <w:t xml:space="preserve">, Chunlin Sun, Hanzhao Wang, </w:t>
-      </w:r>
-      <w:r>
-        <w:rPr>
-          <w:rFonts w:eastAsiaTheme="minorEastAsia"/>
-          <w:bCs/>
-          <w:i/>
-          <w:iCs/>
-          <w:kern w:val="2"/>
-          <w:sz w:val="24"/>
-          <w:szCs w:val="24"/>
-        </w:rPr>
-        <w:t>AISTATS 2024</w:t>
+        <w:t xml:space="preserve">Zhongze Cai*, </w:t>
+      </w:r>
+      <w:r>
+        <w:rPr>
+          <w:rFonts w:eastAsiaTheme="minorEastAsia"/>
+          <w:b/>
+          <w:kern w:val="2"/>
+          <w:sz w:val="24"/>
+          <w:szCs w:val="24"/>
+        </w:rPr>
+        <w:t>Shang Liu</w:t>
+      </w:r>
+      <w:r>
+        <w:rPr>
+          <w:rFonts w:eastAsiaTheme="minorEastAsia" w:hint="eastAsia"/>
+          <w:b/>
+          <w:kern w:val="2"/>
+          <w:sz w:val="24"/>
+          <w:szCs w:val="24"/>
+        </w:rPr>
+        <w:t>*</w:t>
       </w:r>
       <w:r>
         <w:rPr>
@@ -1707,7 +1683,51 @@
           <w:sz w:val="24"/>
           <w:szCs w:val="24"/>
         </w:rPr>
-        <w:t xml:space="preserve"> </w:t>
+        <w:t xml:space="preserve"> Hanzhao Wang*, Huaiyang Zhong,</w:t>
+      </w:r>
+      <w:r>
+        <w:rPr>
+          <w:rFonts w:eastAsiaTheme="minorEastAsia"/>
+          <w:bCs/>
+          <w:kern w:val="2"/>
+          <w:sz w:val="24"/>
+          <w:szCs w:val="24"/>
+        </w:rPr>
+        <w:t xml:space="preserve"> Xiaocheng Li, </w:t>
+      </w:r>
+      <w:r>
+        <w:rPr>
+          <w:rFonts w:eastAsiaTheme="minorEastAsia" w:hint="eastAsia"/>
+          <w:bCs/>
+          <w:i/>
+          <w:iCs/>
+          <w:kern w:val="2"/>
+          <w:sz w:val="24"/>
+          <w:szCs w:val="24"/>
+        </w:rPr>
+        <w:t>accepted</w:t>
+      </w:r>
+      <w:r>
+        <w:rPr>
+          <w:rFonts w:eastAsiaTheme="minorEastAsia"/>
+          <w:bCs/>
+          <w:i/>
+          <w:iCs/>
+          <w:kern w:val="2"/>
+          <w:sz w:val="24"/>
+          <w:szCs w:val="24"/>
+        </w:rPr>
+        <w:t xml:space="preserve"> at Journal of the American Statistical Association</w:t>
+      </w:r>
+      <w:r>
+        <w:rPr>
+          <w:rFonts w:eastAsiaTheme="minorEastAsia" w:hint="eastAsia"/>
+          <w:bCs/>
+          <w:kern w:val="2"/>
+          <w:sz w:val="24"/>
+          <w:szCs w:val="24"/>
+        </w:rPr>
+        <w:t xml:space="preserve">, </w:t>
       </w:r>
       <w:hyperlink r:id="rId13" w:history="1">
         <w:r>
@@ -1751,23 +1771,13 @@
       </w:pPr>
       <w:r>
         <w:rPr>
-          <w:rFonts w:eastAsiaTheme="minorEastAsia" w:hint="eastAsia"/>
-          <w:b/>
-          <w:kern w:val="2"/>
-          <w:sz w:val="24"/>
-          <w:szCs w:val="24"/>
-        </w:rPr>
-        <w:t>Un</w:t>
-      </w:r>
-      <w:r>
-        <w:rPr>
-          <w:rFonts w:eastAsiaTheme="minorEastAsia"/>
-          <w:b/>
-          <w:kern w:val="2"/>
-          <w:sz w:val="24"/>
-          <w:szCs w:val="24"/>
-        </w:rPr>
-        <w:t>derstanding Uncertainty Sampling</w:t>
+          <w:rFonts w:eastAsiaTheme="minorEastAsia"/>
+          <w:b/>
+          <w:kern w:val="2"/>
+          <w:sz w:val="24"/>
+          <w:szCs w:val="24"/>
+        </w:rPr>
+        <w:t>When No-Rejection Learning is Consistent for Regression with Rejection</w:t>
       </w:r>
     </w:p>
     <w:p>
@@ -1785,71 +1795,55 @@
       </w:pPr>
       <w:r>
         <w:rPr>
-          <w:rFonts w:eastAsiaTheme="minorEastAsia"/>
-          <w:b/>
-          <w:kern w:val="2"/>
-          <w:sz w:val="24"/>
-          <w:szCs w:val="24"/>
-        </w:rPr>
-        <w:t>Shang Liu</w:t>
-      </w:r>
-      <w:r>
-        <w:rPr>
-          <w:rFonts w:eastAsiaTheme="minorEastAsia"/>
-          <w:bCs/>
-          <w:kern w:val="2"/>
-          <w:sz w:val="24"/>
-          <w:szCs w:val="24"/>
-        </w:rPr>
-        <w:t xml:space="preserve">, Xiaocheng Li, </w:t>
-      </w:r>
-      <w:r>
-        <w:rPr>
-          <w:rFonts w:eastAsiaTheme="minorEastAsia" w:hint="eastAsia"/>
-          <w:bCs/>
-          <w:i/>
-          <w:iCs/>
-          <w:kern w:val="2"/>
-          <w:sz w:val="24"/>
-          <w:szCs w:val="24"/>
-        </w:rPr>
-        <w:t>Reject and Resubmi</w:t>
-      </w:r>
-      <w:r>
-        <w:rPr>
-          <w:rFonts w:eastAsiaTheme="minorEastAsia" w:hint="eastAsia"/>
-          <w:bCs/>
-          <w:i/>
-          <w:iCs/>
-          <w:kern w:val="2"/>
-          <w:sz w:val="24"/>
-          <w:szCs w:val="24"/>
-        </w:rPr>
-        <w:t>t</w:t>
-      </w:r>
-      <w:r>
-        <w:rPr>
-          <w:rFonts w:eastAsiaTheme="minorEastAsia" w:hint="eastAsia"/>
-          <w:bCs/>
-          <w:i/>
-          <w:iCs/>
-          <w:kern w:val="2"/>
-          <w:sz w:val="24"/>
-          <w:szCs w:val="24"/>
-        </w:rPr>
-        <w:t xml:space="preserve"> at </w:t>
-      </w:r>
-      <w:r>
-        <w:rPr>
-          <w:rFonts w:eastAsiaTheme="minorEastAsia"/>
-          <w:bCs/>
-          <w:i/>
-          <w:iCs/>
-          <w:kern w:val="2"/>
-          <w:sz w:val="24"/>
-          <w:szCs w:val="24"/>
-        </w:rPr>
-        <w:t>Journal of Machine Learning Research</w:t>
+          <w:rFonts w:eastAsiaTheme="minorEastAsia" w:hint="eastAsia"/>
+          <w:bCs/>
+          <w:kern w:val="2"/>
+          <w:sz w:val="24"/>
+          <w:szCs w:val="24"/>
+        </w:rPr>
+        <w:t>X</w:t>
+      </w:r>
+      <w:r>
+        <w:rPr>
+          <w:rFonts w:eastAsiaTheme="minorEastAsia"/>
+          <w:bCs/>
+          <w:kern w:val="2"/>
+          <w:sz w:val="24"/>
+          <w:szCs w:val="24"/>
+        </w:rPr>
+        <w:t>iaocheng Li,</w:t>
+      </w:r>
+      <w:r>
+        <w:rPr>
+          <w:rFonts w:eastAsiaTheme="minorEastAsia"/>
+          <w:b/>
+          <w:kern w:val="2"/>
+          <w:sz w:val="24"/>
+          <w:szCs w:val="24"/>
+        </w:rPr>
+        <w:t xml:space="preserve"> Shang Liu</w:t>
+      </w:r>
+      <w:r>
+        <w:rPr>
+          <w:rFonts w:eastAsiaTheme="minorEastAsia"/>
+          <w:bCs/>
+          <w:kern w:val="2"/>
+          <w:sz w:val="24"/>
+          <w:szCs w:val="24"/>
+        </w:rPr>
+        <w:t xml:space="preserve">, Chunlin Sun, Hanzhao Wang, </w:t>
+      </w:r>
+      <w:r>
+        <w:rPr>
+          <w:rFonts w:eastAsiaTheme="minorEastAsia"/>
+          <w:bCs/>
+          <w:i/>
+          <w:iCs/>
+          <w:kern w:val="2"/>
+          <w:sz w:val="24"/>
+          <w:szCs w:val="24"/>
+        </w:rPr>
+        <w:t>AISTATS 2024</w:t>
       </w:r>
       <w:r>
         <w:rPr>
@@ -1904,22 +1898,42 @@
         <w:adjustRightInd w:val="0"/>
         <w:ind w:leftChars="149" w:left="283"/>
         <w:rPr>
-          <w:rFonts w:eastAsiaTheme="minorEastAsia"/>
-          <w:b/>
-          <w:kern w:val="2"/>
-          <w:sz w:val="24"/>
-          <w:szCs w:val="24"/>
-        </w:rPr>
-      </w:pPr>
-      <w:r>
-        <w:rPr>
-          <w:rFonts w:eastAsiaTheme="minorEastAsia"/>
-          <w:b/>
-          <w:kern w:val="2"/>
-          <w:sz w:val="24"/>
-          <w:szCs w:val="24"/>
-        </w:rPr>
-        <w:t>Distribution-Free Model-Agnostic Regression Calibration via Nonparametric Methods</w:t>
+          <w:rFonts w:eastAsiaTheme="minorEastAsia" w:hint="eastAsia"/>
+          <w:b/>
+          <w:kern w:val="2"/>
+          <w:sz w:val="24"/>
+          <w:szCs w:val="24"/>
+        </w:rPr>
+      </w:pPr>
+      <w:r>
+        <w:rPr>
+          <w:rFonts w:eastAsiaTheme="minorEastAsia" w:hint="eastAsia"/>
+          <w:b/>
+          <w:kern w:val="2"/>
+          <w:sz w:val="24"/>
+          <w:szCs w:val="24"/>
+        </w:rPr>
+        <w:t>Un</w:t>
+      </w:r>
+      <w:r>
+        <w:rPr>
+          <w:rFonts w:eastAsiaTheme="minorEastAsia"/>
+          <w:b/>
+          <w:kern w:val="2"/>
+          <w:sz w:val="24"/>
+          <w:szCs w:val="24"/>
+        </w:rPr>
+        <w:t>derstanding Uncertainty Sampling</w:t>
+      </w:r>
+      <w:r>
+        <w:rPr>
+          <w:rFonts w:eastAsiaTheme="minorEastAsia" w:hint="eastAsia"/>
+          <w:b/>
+          <w:kern w:val="2"/>
+          <w:sz w:val="24"/>
+          <w:szCs w:val="24"/>
+        </w:rPr>
+        <w:t xml:space="preserve"> via Equivalent Loss</w:t>
       </w:r>
     </w:p>
     <w:p>
@@ -1929,9 +1943,8 @@
         <w:adjustRightInd w:val="0"/>
         <w:ind w:leftChars="149" w:left="283"/>
         <w:rPr>
-          <w:rFonts w:eastAsiaTheme="minorEastAsia"/>
-          <w:bCs/>
-          <w:kern w:val="2"/>
+          <w:rStyle w:val="Hyperlink"/>
+          <w:iCs/>
           <w:sz w:val="24"/>
           <w:szCs w:val="24"/>
         </w:rPr>
@@ -1954,39 +1967,55 @@
           <w:sz w:val="24"/>
           <w:szCs w:val="24"/>
         </w:rPr>
-        <w:t xml:space="preserve">*, </w:t>
-      </w:r>
-      <w:r>
-        <w:rPr>
-          <w:rFonts w:eastAsiaTheme="minorEastAsia" w:hint="eastAsia"/>
-          <w:bCs/>
-          <w:kern w:val="2"/>
-          <w:sz w:val="24"/>
-          <w:szCs w:val="24"/>
-        </w:rPr>
-        <w:t>Z</w:t>
-      </w:r>
-      <w:r>
-        <w:rPr>
-          <w:rFonts w:eastAsiaTheme="minorEastAsia"/>
-          <w:bCs/>
-          <w:kern w:val="2"/>
-          <w:sz w:val="24"/>
-          <w:szCs w:val="24"/>
-        </w:rPr>
-        <w:t xml:space="preserve">hongze Cai*, Xiaocheng Li, </w:t>
-      </w:r>
-      <w:r>
-        <w:rPr>
-          <w:rFonts w:eastAsiaTheme="minorEastAsia"/>
-          <w:bCs/>
-          <w:i/>
-          <w:iCs/>
-          <w:kern w:val="2"/>
-          <w:sz w:val="24"/>
-          <w:szCs w:val="24"/>
-        </w:rPr>
-        <w:t>NeurIPS 2023</w:t>
+        <w:t xml:space="preserve">, Xiaocheng Li, </w:t>
+      </w:r>
+      <w:r>
+        <w:rPr>
+          <w:rFonts w:eastAsiaTheme="minorEastAsia" w:hint="eastAsia"/>
+          <w:bCs/>
+          <w:i/>
+          <w:iCs/>
+          <w:kern w:val="2"/>
+          <w:sz w:val="24"/>
+          <w:szCs w:val="24"/>
+        </w:rPr>
+        <w:t>Reject and Resubmi</w:t>
+      </w:r>
+      <w:r>
+        <w:rPr>
+          <w:rFonts w:eastAsiaTheme="minorEastAsia" w:hint="eastAsia"/>
+          <w:bCs/>
+          <w:i/>
+          <w:iCs/>
+          <w:kern w:val="2"/>
+          <w:sz w:val="24"/>
+          <w:szCs w:val="24"/>
+        </w:rPr>
+        <w:t>t</w:t>
+      </w:r>
+      <w:r>
+        <w:rPr>
+          <w:rFonts w:eastAsiaTheme="minorEastAsia" w:hint="eastAsia"/>
+          <w:bCs/>
+          <w:i/>
+          <w:iCs/>
+          <w:kern w:val="2"/>
+          <w:sz w:val="24"/>
+          <w:szCs w:val="24"/>
+        </w:rPr>
+        <w:t xml:space="preserve"> at </w:t>
+      </w:r>
+      <w:r>
+        <w:rPr>
+          <w:rFonts w:eastAsiaTheme="minorEastAsia"/>
+          <w:bCs/>
+          <w:i/>
+          <w:iCs/>
+          <w:kern w:val="2"/>
+          <w:sz w:val="24"/>
+          <w:szCs w:val="24"/>
+        </w:rPr>
+        <w:t>Journal of Machine Learning Research</w:t>
       </w:r>
       <w:r>
         <w:rPr>
@@ -2056,7 +2085,7 @@
           <w:sz w:val="24"/>
           <w:szCs w:val="24"/>
         </w:rPr>
-        <w:t>Maximum Optimality Margin: A Unified Approach for Contextual Linear Programming and Inverse Linear Programming</w:t>
+        <w:t>Distribution-Free Model-Agnostic Regression Calibration via Nonparametric Methods</w:t>
       </w:r>
     </w:p>
     <w:p>
@@ -2066,22 +2095,13 @@
         <w:adjustRightInd w:val="0"/>
         <w:ind w:leftChars="149" w:left="283"/>
         <w:rPr>
-          <w:rStyle w:val="Hyperlink"/>
-          <w:iCs/>
-          <w:sz w:val="24"/>
-          <w:szCs w:val="24"/>
-        </w:rPr>
-      </w:pPr>
-      <w:r>
-        <w:rPr>
-          <w:rFonts w:eastAsiaTheme="minorEastAsia"/>
-          <w:bCs/>
-          <w:kern w:val="2"/>
-          <w:sz w:val="24"/>
-          <w:szCs w:val="24"/>
-        </w:rPr>
-        <w:t xml:space="preserve">Chunlin Sun*, </w:t>
-      </w:r>
+          <w:rFonts w:eastAsiaTheme="minorEastAsia"/>
+          <w:bCs/>
+          <w:kern w:val="2"/>
+          <w:sz w:val="24"/>
+          <w:szCs w:val="24"/>
+        </w:rPr>
+      </w:pPr>
       <w:r>
         <w:rPr>
           <w:rFonts w:eastAsiaTheme="minorEastAsia"/>
@@ -2100,43 +2120,39 @@
           <w:sz w:val="24"/>
           <w:szCs w:val="24"/>
         </w:rPr>
-        <w:t>*, Xiaocheng Li,</w:t>
-      </w:r>
-      <w:r>
-        <w:rPr>
-          <w:rFonts w:eastAsiaTheme="minorEastAsia"/>
-          <w:bCs/>
-          <w:i/>
-          <w:iCs/>
-          <w:kern w:val="2"/>
-          <w:sz w:val="24"/>
-          <w:szCs w:val="24"/>
-        </w:rPr>
-        <w:t xml:space="preserve"> </w:t>
-      </w:r>
-      <w:r>
-        <w:rPr>
-          <w:rFonts w:eastAsiaTheme="minorEastAsia" w:hint="eastAsia"/>
-          <w:bCs/>
-          <w:i/>
-          <w:iCs/>
-          <w:kern w:val="2"/>
-          <w:sz w:val="24"/>
-          <w:szCs w:val="24"/>
-        </w:rPr>
-        <w:t>ICML</w:t>
-      </w:r>
-      <w:r>
-        <w:rPr>
-          <w:rFonts w:eastAsiaTheme="minorEastAsia"/>
-          <w:bCs/>
-          <w:i/>
-          <w:iCs/>
-          <w:kern w:val="2"/>
-          <w:sz w:val="24"/>
-          <w:szCs w:val="24"/>
-        </w:rPr>
-        <w:t xml:space="preserve"> 2023</w:t>
+        <w:t xml:space="preserve">*, </w:t>
+      </w:r>
+      <w:r>
+        <w:rPr>
+          <w:rFonts w:eastAsiaTheme="minorEastAsia" w:hint="eastAsia"/>
+          <w:bCs/>
+          <w:kern w:val="2"/>
+          <w:sz w:val="24"/>
+          <w:szCs w:val="24"/>
+        </w:rPr>
+        <w:t>Z</w:t>
+      </w:r>
+      <w:r>
+        <w:rPr>
+          <w:rFonts w:eastAsiaTheme="minorEastAsia"/>
+          <w:bCs/>
+          <w:kern w:val="2"/>
+          <w:sz w:val="24"/>
+          <w:szCs w:val="24"/>
+        </w:rPr>
+        <w:t xml:space="preserve">hongze Cai*, Xiaocheng Li, </w:t>
+      </w:r>
+      <w:r>
+        <w:rPr>
+          <w:rFonts w:eastAsiaTheme="minorEastAsia"/>
+          <w:bCs/>
+          <w:i/>
+          <w:iCs/>
+          <w:kern w:val="2"/>
+          <w:sz w:val="24"/>
+          <w:szCs w:val="24"/>
+        </w:rPr>
+        <w:t>NeurIPS 2023</w:t>
       </w:r>
       <w:r>
         <w:rPr>
@@ -2206,7 +2222,7 @@
           <w:sz w:val="24"/>
           <w:szCs w:val="24"/>
         </w:rPr>
-        <w:t>Non-stationary Bandits with Knapsacks</w:t>
+        <w:t>Maximum Optimality Margin: A Unified Approach for Contextual Linear Programming and Inverse Linear Programming</w:t>
       </w:r>
     </w:p>
     <w:p>
@@ -2217,6 +2233,156 @@
         <w:ind w:leftChars="149" w:left="283"/>
         <w:rPr>
           <w:rStyle w:val="Hyperlink"/>
+          <w:iCs/>
+          <w:sz w:val="24"/>
+          <w:szCs w:val="24"/>
+        </w:rPr>
+      </w:pPr>
+      <w:r>
+        <w:rPr>
+          <w:rFonts w:eastAsiaTheme="minorEastAsia"/>
+          <w:bCs/>
+          <w:kern w:val="2"/>
+          <w:sz w:val="24"/>
+          <w:szCs w:val="24"/>
+        </w:rPr>
+        <w:t xml:space="preserve">Chunlin Sun*, </w:t>
+      </w:r>
+      <w:r>
+        <w:rPr>
+          <w:rFonts w:eastAsiaTheme="minorEastAsia"/>
+          <w:b/>
+          <w:kern w:val="2"/>
+          <w:sz w:val="24"/>
+          <w:szCs w:val="24"/>
+        </w:rPr>
+        <w:t>Shang Liu</w:t>
+      </w:r>
+      <w:r>
+        <w:rPr>
+          <w:rFonts w:eastAsiaTheme="minorEastAsia"/>
+          <w:bCs/>
+          <w:kern w:val="2"/>
+          <w:sz w:val="24"/>
+          <w:szCs w:val="24"/>
+        </w:rPr>
+        <w:t>*, Xiaocheng Li,</w:t>
+      </w:r>
+      <w:r>
+        <w:rPr>
+          <w:rFonts w:eastAsiaTheme="minorEastAsia"/>
+          <w:bCs/>
+          <w:i/>
+          <w:iCs/>
+          <w:kern w:val="2"/>
+          <w:sz w:val="24"/>
+          <w:szCs w:val="24"/>
+        </w:rPr>
+        <w:t xml:space="preserve"> </w:t>
+      </w:r>
+      <w:r>
+        <w:rPr>
+          <w:rFonts w:eastAsiaTheme="minorEastAsia" w:hint="eastAsia"/>
+          <w:bCs/>
+          <w:i/>
+          <w:iCs/>
+          <w:kern w:val="2"/>
+          <w:sz w:val="24"/>
+          <w:szCs w:val="24"/>
+        </w:rPr>
+        <w:t>ICML</w:t>
+      </w:r>
+      <w:r>
+        <w:rPr>
+          <w:rFonts w:eastAsiaTheme="minorEastAsia"/>
+          <w:bCs/>
+          <w:i/>
+          <w:iCs/>
+          <w:kern w:val="2"/>
+          <w:sz w:val="24"/>
+          <w:szCs w:val="24"/>
+        </w:rPr>
+        <w:t xml:space="preserve"> 2023</w:t>
+      </w:r>
+      <w:r>
+        <w:rPr>
+          <w:rFonts w:eastAsiaTheme="minorEastAsia"/>
+          <w:bCs/>
+          <w:kern w:val="2"/>
+          <w:sz w:val="24"/>
+          <w:szCs w:val="24"/>
+        </w:rPr>
+        <w:t>,</w:t>
+      </w:r>
+      <w:r>
+        <w:rPr>
+          <w:rFonts w:eastAsiaTheme="minorEastAsia" w:hint="eastAsia"/>
+          <w:bCs/>
+          <w:kern w:val="2"/>
+          <w:sz w:val="24"/>
+          <w:szCs w:val="24"/>
+        </w:rPr>
+        <w:t xml:space="preserve"> </w:t>
+      </w:r>
+      <w:hyperlink r:id="rId17" w:history="1">
+        <w:r>
+          <w:rPr>
+            <w:rStyle w:val="Hyperlink"/>
+            <w:iCs/>
+            <w:sz w:val="24"/>
+            <w:szCs w:val="24"/>
+          </w:rPr>
+          <w:t>arXiv</w:t>
+        </w:r>
+      </w:hyperlink>
+    </w:p>
+    <w:p>
+      <w:pPr>
+        <w:autoSpaceDE w:val="0"/>
+        <w:autoSpaceDN w:val="0"/>
+        <w:adjustRightInd w:val="0"/>
+        <w:ind w:leftChars="149" w:left="283"/>
+        <w:rPr>
+          <w:rStyle w:val="Hyperlink"/>
+          <w:iCs/>
+          <w:sz w:val="24"/>
+          <w:szCs w:val="24"/>
+        </w:rPr>
+      </w:pPr>
+    </w:p>
+    <w:p>
+      <w:pPr>
+        <w:autoSpaceDE w:val="0"/>
+        <w:autoSpaceDN w:val="0"/>
+        <w:adjustRightInd w:val="0"/>
+        <w:ind w:leftChars="149" w:left="283"/>
+        <w:rPr>
+          <w:rFonts w:eastAsiaTheme="minorEastAsia"/>
+          <w:b/>
+          <w:kern w:val="2"/>
+          <w:sz w:val="24"/>
+          <w:szCs w:val="24"/>
+        </w:rPr>
+      </w:pPr>
+      <w:r>
+        <w:rPr>
+          <w:rFonts w:eastAsiaTheme="minorEastAsia"/>
+          <w:b/>
+          <w:kern w:val="2"/>
+          <w:sz w:val="24"/>
+          <w:szCs w:val="24"/>
+        </w:rPr>
+        <w:t>Non-stationary Bandits with Knapsacks</w:t>
+      </w:r>
+    </w:p>
+    <w:p>
+      <w:pPr>
+        <w:autoSpaceDE w:val="0"/>
+        <w:autoSpaceDN w:val="0"/>
+        <w:adjustRightInd w:val="0"/>
+        <w:ind w:leftChars="149" w:left="283"/>
+        <w:rPr>
+          <w:rStyle w:val="Hyperlink"/>
           <w:rFonts w:eastAsiaTheme="minorEastAsia"/>
           <w:bCs/>
           <w:i/>
@@ -2292,7 +2458,7 @@
         </w:rPr>
         <w:t xml:space="preserve"> </w:t>
       </w:r>
-      <w:hyperlink r:id="rId17" w:history="1">
+      <w:hyperlink r:id="rId18" w:history="1">
         <w:r>
           <w:rPr>
             <w:rStyle w:val="Hyperlink"/>
@@ -2425,7 +2591,7 @@
         </w:rPr>
         <w:t xml:space="preserve"> </w:t>
       </w:r>
-      <w:hyperlink r:id="rId18" w:history="1">
+      <w:hyperlink r:id="rId19" w:history="1">
         <w:r>
           <w:rPr>
             <w:rStyle w:val="Hyperlink"/>
@@ -2579,16 +2745,17 @@
       <w:pPr>
         <w:ind w:firstLine="420"/>
         <w:rPr>
-          <w:sz w:val="28"/>
-          <w:szCs w:val="22"/>
-        </w:rPr>
-      </w:pPr>
-      <w:r>
-        <w:rPr>
           <w:rFonts w:hint="eastAsia"/>
           <w:sz w:val="28"/>
           <w:szCs w:val="22"/>
         </w:rPr>
+      </w:pPr>
+      <w:r>
+        <w:rPr>
+          <w:rFonts w:hint="eastAsia"/>
+          <w:sz w:val="28"/>
+          <w:szCs w:val="22"/>
+        </w:rPr>
         <w:t>Reviewer: NeurIPS</w:t>
       </w:r>
       <w:r>
@@ -2606,6 +2773,14 @@
           <w:szCs w:val="22"/>
         </w:rPr>
         <w:t>, ICML, TMLR</w:t>
+      </w:r>
+      <w:r>
+        <w:rPr>
+          <w:rFonts w:hint="eastAsia"/>
+          <w:sz w:val="28"/>
+          <w:szCs w:val="22"/>
+        </w:rPr>
+        <w:t>, INFORMS IJDS</w:t>
       </w:r>
     </w:p>
     <w:p>
@@ -2656,13 +2831,22 @@
         </w:rPr>
         <w:t>TA:</w:t>
       </w:r>
+    </w:p>
+    <w:p>
+      <w:pPr>
+        <w:ind w:firstLine="420"/>
+        <w:rPr>
+          <w:sz w:val="28"/>
+          <w:szCs w:val="22"/>
+        </w:rPr>
+      </w:pPr>
       <w:r>
         <w:rPr>
           <w:rFonts w:hint="eastAsia"/>
           <w:sz w:val="28"/>
           <w:szCs w:val="22"/>
         </w:rPr>
-        <w:t xml:space="preserve"> </w:t>
+        <w:t>Machine Learning</w:t>
       </w:r>
       <w:r>
         <w:rPr>
@@ -2670,7 +2854,7 @@
           <w:sz w:val="28"/>
           <w:szCs w:val="22"/>
         </w:rPr>
-        <w:t>Machine Learning</w:t>
+        <w:t>,</w:t>
       </w:r>
       <w:r>
         <w:rPr>
@@ -2678,7 +2862,7 @@
           <w:sz w:val="28"/>
           <w:szCs w:val="22"/>
         </w:rPr>
-        <w:t>,</w:t>
+        <w:t xml:space="preserve"> Imperial College London</w:t>
       </w:r>
       <w:r>
         <w:rPr>
@@ -2686,7 +2870,7 @@
           <w:sz w:val="28"/>
           <w:szCs w:val="22"/>
         </w:rPr>
-        <w:t xml:space="preserve"> Imperial College London</w:t>
+        <w:t xml:space="preserve">, </w:t>
       </w:r>
       <w:r>
         <w:rPr>
@@ -2694,7 +2878,7 @@
           <w:sz w:val="28"/>
           <w:szCs w:val="22"/>
         </w:rPr>
-        <w:t xml:space="preserve">, </w:t>
+        <w:t>Spring 2024</w:t>
       </w:r>
       <w:r>
         <w:rPr>
@@ -2702,7 +2886,41 @@
           <w:sz w:val="28"/>
           <w:szCs w:val="22"/>
         </w:rPr>
-        <w:t>Spring 2024 and Spring 2025</w:t>
+        <w:t>/2025/2026</w:t>
+      </w:r>
+    </w:p>
+    <w:p>
+      <w:pPr>
+        <w:ind w:firstLine="420"/>
+        <w:rPr>
+          <w:rFonts w:hint="eastAsia"/>
+          <w:sz w:val="28"/>
+          <w:szCs w:val="22"/>
+        </w:rPr>
+      </w:pPr>
+      <w:r>
+        <w:rPr>
+          <w:rFonts w:hint="eastAsia"/>
+          <w:sz w:val="28"/>
+          <w:szCs w:val="22"/>
+        </w:rPr>
+        <w:t>Generative AI and Large Language Models,</w:t>
+      </w:r>
+      <w:r>
+        <w:rPr>
+          <w:rFonts w:hint="eastAsia"/>
+          <w:sz w:val="28"/>
+          <w:szCs w:val="22"/>
+        </w:rPr>
+        <w:t xml:space="preserve"> Imperial College London,</w:t>
+      </w:r>
+      <w:r>
+        <w:rPr>
+          <w:rFonts w:hint="eastAsia"/>
+          <w:sz w:val="28"/>
+          <w:szCs w:val="22"/>
+        </w:rPr>
+        <w:t xml:space="preserve"> Spring 2025/2026</w:t>
       </w:r>
     </w:p>
     <w:sectPr>
@@ -3918,7 +4136,7 @@
   <w:style w:type="paragraph" w:default="1" w:styleId="Normal">
     <w:name w:val="Normal"/>
     <w:qFormat/>
-    <w:rsid w:val="00774019"/>
+    <w:rsid w:val="008373A8"/>
     <w:rPr>
       <w:rFonts w:ascii="Times New Roman" w:eastAsia="宋体" w:hAnsi="Times New Roman" w:cs="Times New Roman"/>
       <w:kern w:val="0"/>

</xml_diff>